<commit_message>
Audit fixes + extended TCGA-LUAD analysis: GEO validation (GSE31210), TRU/PI/PP subtypes, IGKC signature, B/W figures; unify reported stats (d_topo, RL99, r, ARI)
</commit_message>
<xml_diff>
--- a/article/gdc_article_biology.docx
+++ b/article/gdc_article_biology.docx
@@ -50,7 +50,7 @@
         <w:t>иммуноглобулиновый модуль</w:t>
       </w:r>
       <w:r>
-        <w:t xml:space="preserve"> (IGKC, IGKV3-20, IGKV1-5, IGLC2, IGHV…): доминирующий когерентный фактор транскриптома — B-клеточная/плазмоклеточная инфильтрация. Выживаемость по физиотипам (tumor-only, пациенты): log-rank p &lt; 0.001; медиана OS физиотипа 3 (иммунно-холодного, пролиферативного) — 1171 день против ≈ 1500 у физиотипов 1–2; после поправки на стадию и возраст тренд ослабевает (стадия: HR = 2.56, p &lt; 0.001). Предложены биологические названия физиотипов: 1 — «стромально-гликолитический (ECM/EMT + IgA)», 2 — «обонятельно-рецепторный / слабо-стромальный», 3 — «биосинтетически-пролиферативный, иммунно-холодный».</w:t>
+        <w:t xml:space="preserve"> (IGKC, IGKV3-20, IGKV1-5, IGLC2, IGHV…): доминирующий когерентный фактор транскриптома — B-клеточная/плазмоклеточная инфильтрация. Выживаемость по физиотипам (tumor-only, пациенты): log-rank p &lt; 0.001; медиана OS физиотипа 3 (иммунно-холодного, пролиферативного) — 1171 день против ≈ 1500 у физиотипов 1–2; после поправки на стадию и возраст тренд ослабевает (стадия: HR = 2.56, p &lt; 0.001). IGKC-сигнатура (20 генов λ_max-модуля, медианный сплит) даёт пограничный защитный тренд (HR = 0.83, p = 0.15), а внутри стадий физиотип не различает выживаемость (HR = 1.1–1.2). Физиотипы согласуются с классическими подтипами TRU/PI/PP (χ² = 14.44, p = 0.006): PH1→TRU, PH2→PI, PH3→PP; порядок выживаемости по подтипам совпадает (TRU 1830 &gt; PI 1357 &gt; PP 1115 дней). Внешняя валидация (GSE31210, 226 опухолей) воспроизводит структуру физиотипов (bootstrap ARI 0.684, IG-кластер) и опухоль/норма-дивергенцию (d̄_topo = 0.670, p &lt; 0.005), но не прогностические ассоциации — ограничения мощности (35 OS-событий) и покрытия GPL570 (2/20 генов IGKC-модуля). Предложены биологические названия физиотипов: 1 — «стромально-гликолитический (ECM/EMT + IgA)», 2 — «обонятельно-рецепторный / слабо-стромальный», 3 — «биосинтетически-пролиферативный, иммунно-холодный».</w:t>
       </w:r>
     </w:p>
     <w:p>
@@ -170,7 +170,7 @@
         <w:jc w:val="both"/>
       </w:pPr>
       <w:r>
-        <w:t>Клиническая матрица TCGA-LUAD (Xena hub, 706 образцов): pathologic_stage, vital_status, days_to_death/last_followup, возраст. Присоединение к образцам через case_id (601 из 601 образцов, стадия есть у 591). Стадии сгруппированы I/II vs III/IV. Ассоциации — χ². Выживаемость: KM-кривые и лог-ранг по физиотипам (tumor-only, одна строка на пациента, 507 пациентов, 193 события), Cox PH (возраст + стадия) — lifelines.</w:t>
+        <w:t>Клиническая матрица TCGA-LUAD (Xena hub, 706 образцов): pathologic_stage, vital_status, days_to_death/last_followup, возраст. Присоединение к образцам через case_id (601 из 601 образцов, стадия есть у 591). Стадии сгруппированы I/II vs III/IV. Ассоциации — χ². Выживаемость: KM-кривые и лог-ранг по физиотипам (tumor-only, одна строка на пациента, 507 пациентов, 183 события), Cox PH (возраст + стадия) — lifelines.</w:t>
       </w:r>
     </w:p>
     <w:p>
@@ -304,7 +304,7 @@
           </w:tcPr>
           <w:p>
             <w:r>
-              <w:t>12 874</w:t>
+              <w:t>11 485</w:t>
             </w:r>
           </w:p>
         </w:tc>
@@ -326,7 +326,7 @@
           </w:tcPr>
           <w:p>
             <w:r>
-              <w:t>3 421</w:t>
+              <w:t>3 284</w:t>
             </w:r>
           </w:p>
         </w:tc>
@@ -1255,7 +1255,7 @@
         <w:pStyle w:val="Heading2"/>
       </w:pPr>
       <w:r>
-        <w:t>3.7 Выживаемость по физиотипам</w:t>
+        <w:t>3.7 Физиотипы и молекулярные подтипы LUAD (TRU/PI/PP)</w:t>
       </w:r>
     </w:p>
     <w:p>
@@ -1263,7 +1263,294 @@
         <w:jc w:val="both"/>
       </w:pPr>
       <w:r>
-        <w:t>Tumor-only, одна строка на пациента, 507 пациентов, 193 события (медиана наблюдения ~1500 дней).</w:t>
+        <w:t>Для биологической валидации физиотипы сопоставлены с классическими молекулярными подтипами аденокарциномы лёгкого — терминальными респираторными единицами (TRU), проксимально-воспалительным (PI) и проксимально-пролиферативным (PP) — из независимого внешнего набора Nature 2014 (n = 230 образцов TCGA-LUAD; метка Expression Subtype доступна у 221 из 507 пациентов).</w:t>
+      </w:r>
+    </w:p>
+    <w:tbl>
+      <w:tblPr>
+        <w:tblStyle w:val="LightGrid-Accent1"/>
+        <w:tblW w:type="auto" w:w="0"/>
+        <w:tblLook w:firstColumn="1" w:firstRow="1" w:lastColumn="0" w:lastRow="0" w:noHBand="0" w:noVBand="1" w:val="04A0"/>
+      </w:tblPr>
+      <w:tblGrid>
+        <w:gridCol w:w="1728"/>
+        <w:gridCol w:w="1728"/>
+        <w:gridCol w:w="1728"/>
+        <w:gridCol w:w="1728"/>
+        <w:gridCol w:w="1728"/>
+      </w:tblGrid>
+      <w:tr>
+        <w:tc>
+          <w:tcPr>
+            <w:tcW w:type="dxa" w:w="1728"/>
+          </w:tcPr>
+          <w:p>
+            <w:r>
+              <w:rPr>
+                <w:b/>
+              </w:rPr>
+              <w:t>Физиотип</w:t>
+            </w:r>
+          </w:p>
+        </w:tc>
+        <w:tc>
+          <w:tcPr>
+            <w:tcW w:type="dxa" w:w="1728"/>
+          </w:tcPr>
+          <w:p>
+            <w:r>
+              <w:rPr>
+                <w:b/>
+              </w:rPr>
+              <w:t>TRU</w:t>
+            </w:r>
+          </w:p>
+        </w:tc>
+        <w:tc>
+          <w:tcPr>
+            <w:tcW w:type="dxa" w:w="1728"/>
+          </w:tcPr>
+          <w:p>
+            <w:r>
+              <w:rPr>
+                <w:b/>
+              </w:rPr>
+              <w:t>PI</w:t>
+            </w:r>
+          </w:p>
+        </w:tc>
+        <w:tc>
+          <w:tcPr>
+            <w:tcW w:type="dxa" w:w="1728"/>
+          </w:tcPr>
+          <w:p>
+            <w:r>
+              <w:rPr>
+                <w:b/>
+              </w:rPr>
+              <w:t>PP</w:t>
+            </w:r>
+          </w:p>
+        </w:tc>
+        <w:tc>
+          <w:tcPr>
+            <w:tcW w:type="dxa" w:w="1728"/>
+          </w:tcPr>
+          <w:p>
+            <w:r>
+              <w:rPr>
+                <w:b/>
+              </w:rPr>
+              <w:t>Доминанта</w:t>
+            </w:r>
+          </w:p>
+        </w:tc>
+      </w:tr>
+      <w:tr>
+        <w:tc>
+          <w:tcPr>
+            <w:tcW w:type="dxa" w:w="1728"/>
+          </w:tcPr>
+          <w:p>
+            <w:r>
+              <w:t>1</w:t>
+            </w:r>
+          </w:p>
+        </w:tc>
+        <w:tc>
+          <w:tcPr>
+            <w:tcW w:type="dxa" w:w="1728"/>
+          </w:tcPr>
+          <w:p>
+            <w:r>
+              <w:t>63 (44%)</w:t>
+            </w:r>
+          </w:p>
+        </w:tc>
+        <w:tc>
+          <w:tcPr>
+            <w:tcW w:type="dxa" w:w="1728"/>
+          </w:tcPr>
+          <w:p>
+            <w:r>
+              <w:t>37</w:t>
+            </w:r>
+          </w:p>
+        </w:tc>
+        <w:tc>
+          <w:tcPr>
+            <w:tcW w:type="dxa" w:w="1728"/>
+          </w:tcPr>
+          <w:p>
+            <w:r>
+              <w:t>42</w:t>
+            </w:r>
+          </w:p>
+        </w:tc>
+        <w:tc>
+          <w:tcPr>
+            <w:tcW w:type="dxa" w:w="1728"/>
+          </w:tcPr>
+          <w:p>
+            <w:r>
+              <w:t>TRU</w:t>
+            </w:r>
+          </w:p>
+        </w:tc>
+      </w:tr>
+      <w:tr>
+        <w:tc>
+          <w:tcPr>
+            <w:tcW w:type="dxa" w:w="1728"/>
+          </w:tcPr>
+          <w:p>
+            <w:r>
+              <w:t>2</w:t>
+            </w:r>
+          </w:p>
+        </w:tc>
+        <w:tc>
+          <w:tcPr>
+            <w:tcW w:type="dxa" w:w="1728"/>
+          </w:tcPr>
+          <w:p>
+            <w:r>
+              <w:t>21 (33%)</w:t>
+            </w:r>
+          </w:p>
+        </w:tc>
+        <w:tc>
+          <w:tcPr>
+            <w:tcW w:type="dxa" w:w="1728"/>
+          </w:tcPr>
+          <w:p>
+            <w:r>
+              <w:t>30 (48%)</w:t>
+            </w:r>
+          </w:p>
+        </w:tc>
+        <w:tc>
+          <w:tcPr>
+            <w:tcW w:type="dxa" w:w="1728"/>
+          </w:tcPr>
+          <w:p>
+            <w:r>
+              <w:t>12</w:t>
+            </w:r>
+          </w:p>
+        </w:tc>
+        <w:tc>
+          <w:tcPr>
+            <w:tcW w:type="dxa" w:w="1728"/>
+          </w:tcPr>
+          <w:p>
+            <w:r>
+              <w:t>PI</w:t>
+            </w:r>
+          </w:p>
+        </w:tc>
+      </w:tr>
+      <w:tr>
+        <w:tc>
+          <w:tcPr>
+            <w:tcW w:type="dxa" w:w="1728"/>
+          </w:tcPr>
+          <w:p>
+            <w:r>
+              <w:t>3</w:t>
+            </w:r>
+          </w:p>
+        </w:tc>
+        <w:tc>
+          <w:tcPr>
+            <w:tcW w:type="dxa" w:w="1728"/>
+          </w:tcPr>
+          <w:p>
+            <w:r>
+              <w:t>2 (12%)</w:t>
+            </w:r>
+          </w:p>
+        </w:tc>
+        <w:tc>
+          <w:tcPr>
+            <w:tcW w:type="dxa" w:w="1728"/>
+          </w:tcPr>
+          <w:p>
+            <w:r>
+              <w:t>7</w:t>
+            </w:r>
+          </w:p>
+        </w:tc>
+        <w:tc>
+          <w:tcPr>
+            <w:tcW w:type="dxa" w:w="1728"/>
+          </w:tcPr>
+          <w:p>
+            <w:r>
+              <w:t>7 (44%)</w:t>
+            </w:r>
+          </w:p>
+        </w:tc>
+        <w:tc>
+          <w:tcPr>
+            <w:tcW w:type="dxa" w:w="1728"/>
+          </w:tcPr>
+          <w:p>
+            <w:r>
+              <w:t>PP</w:t>
+            </w:r>
+          </w:p>
+        </w:tc>
+      </w:tr>
+    </w:tbl>
+    <w:p>
+      <w:pPr>
+        <w:jc w:val="both"/>
+      </w:pPr>
+      <w:r>
+        <w:t xml:space="preserve">χ² = 14.44, </w:t>
+      </w:r>
+      <w:r>
+        <w:rPr>
+          <w:b/>
+        </w:rPr>
+        <w:t>p = 0.006</w:t>
+      </w:r>
+      <w:r>
+        <w:t xml:space="preserve"> (df = 4); ARI = 0.027 (при дисбалансе меток низкий ARI ожидаем). Физиотип 1 (стромально-гликолитический) обогащён TRU — терминальными респираторными/сурфактантными опухолями; физиотип 2 — PI (воспалительный, B-клеточный профиль); физиотип 3 (пролиферативный, иммунно-холодный) — PP (пролиферация, отсутствие воспаления). Направления согласуются с путями из п. 3.11: PP противовоспалителен, TRU сурфактантен.</w:t>
+      </w:r>
+    </w:p>
+    <w:p>
+      <w:pPr>
+        <w:jc w:val="both"/>
+      </w:pPr>
+      <w:r>
+        <w:t xml:space="preserve">Выживаемость по подтипам (однофакторно, n = 221): TRU — медиана OS 1830 дней, PI — 1357, PP — </w:t>
+      </w:r>
+      <w:r>
+        <w:rPr>
+          <w:b/>
+        </w:rPr>
+        <w:t>1115</w:t>
+      </w:r>
+      <w:r>
+        <w:t xml:space="preserve"> (лог-ранг TRU vs PI p = 0.028; в Cox с поправкой на возраст и стадию подтип незначим: PP HR = 1.02, p = 0.93; TRU HR = 0.74, p = 0.28). Порядок совпадает с физиотипами: худшая выживаемость у пролиферативного/холодного фенотипа в обеих классификациях. При совместной модели (физиотип + подтип + возраст + стадия, n = 214) тренд физиотипа сохраняется на пограничном уровне (HR = 1.30, p = 0.099), подтип незначим — сигнал физиотипа не исчерпывается подтипами.</w:t>
+      </w:r>
+    </w:p>
+    <w:p>
+      <w:pPr>
+        <w:pStyle w:val="Heading2"/>
+      </w:pPr>
+      <w:r>
+        <w:t>3.8 Выживаемость по физиотипам</w:t>
+      </w:r>
+    </w:p>
+    <w:p>
+      <w:pPr>
+        <w:jc w:val="both"/>
+      </w:pPr>
+      <w:r>
+        <w:t>Tumor-only, одна строка на пациента, 507 пациентов, 183 события (медиана наблюдения ~1500 дней).</w:t>
       </w:r>
     </w:p>
     <w:tbl>
@@ -1481,7 +1768,458 @@
         <w:pStyle w:val="Heading2"/>
       </w:pPr>
       <w:r>
-        <w:t>3.8 Устойчивость и сила топологического сигнала (перекрёстная ссылка)</w:t>
+        <w:t>3.9 IGKC-сигнатура: стратификация по стадиям и мутации</w:t>
+      </w:r>
+    </w:p>
+    <w:p>
+      <w:pPr>
+        <w:jc w:val="both"/>
+      </w:pPr>
+      <w:r>
+        <w:t xml:space="preserve">Главный собственный вектор (п. 3.5) формализован как </w:t>
+      </w:r>
+      <w:r>
+        <w:rPr>
+          <w:b/>
+        </w:rPr>
+        <w:t>IGKC-сигнатура</w:t>
+      </w:r>
+      <w:r>
+        <w:t xml:space="preserve"> — 20 генов λ_max-модуля (IGKC, IGKV3-20, IGKV1-5, IGKV3-11, IGKV3-15, IGHV1-18, IGLC2, IGHV5-51, IGKJ1, IGHV3-23, IGHV4-59, IGKV4-1, IGHV3-21, IGHG1, IGLV1-40, IGLV1-47, IGLV3-1, IGKV1-39, IGLV2-23, IGHJ4; все 20 присутствуют в данных). Пациенты разделены по медианному скору (медиана 1.45).</w:t>
+      </w:r>
+    </w:p>
+    <w:tbl>
+      <w:tblPr>
+        <w:tblStyle w:val="LightGrid-Accent1"/>
+        <w:tblW w:type="auto" w:w="0"/>
+        <w:tblLook w:firstColumn="1" w:firstRow="1" w:lastColumn="0" w:lastRow="0" w:noHBand="0" w:noVBand="1" w:val="04A0"/>
+      </w:tblPr>
+      <w:tblGrid>
+        <w:gridCol w:w="2160"/>
+        <w:gridCol w:w="2160"/>
+        <w:gridCol w:w="2160"/>
+        <w:gridCol w:w="2160"/>
+      </w:tblGrid>
+      <w:tr>
+        <w:tc>
+          <w:tcPr>
+            <w:tcW w:type="dxa" w:w="2160"/>
+          </w:tcPr>
+          <w:p>
+            <w:r>
+              <w:rPr>
+                <w:b/>
+              </w:rPr>
+              <w:t>Группа</w:t>
+            </w:r>
+          </w:p>
+        </w:tc>
+        <w:tc>
+          <w:tcPr>
+            <w:tcW w:type="dxa" w:w="2160"/>
+          </w:tcPr>
+          <w:p>
+            <w:r>
+              <w:rPr>
+                <w:b/>
+              </w:rPr>
+              <w:t>n</w:t>
+            </w:r>
+          </w:p>
+        </w:tc>
+        <w:tc>
+          <w:tcPr>
+            <w:tcW w:type="dxa" w:w="2160"/>
+          </w:tcPr>
+          <w:p>
+            <w:r>
+              <w:rPr>
+                <w:b/>
+              </w:rPr>
+              <w:t>Событий</w:t>
+            </w:r>
+          </w:p>
+        </w:tc>
+        <w:tc>
+          <w:tcPr>
+            <w:tcW w:type="dxa" w:w="2160"/>
+          </w:tcPr>
+          <w:p>
+            <w:r>
+              <w:rPr>
+                <w:b/>
+              </w:rPr>
+              <w:t>Медиана OS, дни</w:t>
+            </w:r>
+          </w:p>
+        </w:tc>
+      </w:tr>
+      <w:tr>
+        <w:tc>
+          <w:tcPr>
+            <w:tcW w:type="dxa" w:w="2160"/>
+          </w:tcPr>
+          <w:p>
+            <w:r>
+              <w:t>IGKC-low</w:t>
+            </w:r>
+          </w:p>
+        </w:tc>
+        <w:tc>
+          <w:tcPr>
+            <w:tcW w:type="dxa" w:w="2160"/>
+          </w:tcPr>
+          <w:p>
+            <w:r>
+              <w:t>254</w:t>
+            </w:r>
+          </w:p>
+        </w:tc>
+        <w:tc>
+          <w:tcPr>
+            <w:tcW w:type="dxa" w:w="2160"/>
+          </w:tcPr>
+          <w:p>
+            <w:r>
+              <w:t>100</w:t>
+            </w:r>
+          </w:p>
+        </w:tc>
+        <w:tc>
+          <w:tcPr>
+            <w:tcW w:type="dxa" w:w="2160"/>
+          </w:tcPr>
+          <w:p>
+            <w:r>
+              <w:t>1379</w:t>
+            </w:r>
+          </w:p>
+        </w:tc>
+      </w:tr>
+      <w:tr>
+        <w:tc>
+          <w:tcPr>
+            <w:tcW w:type="dxa" w:w="2160"/>
+          </w:tcPr>
+          <w:p>
+            <w:r>
+              <w:t>IGKC-high</w:t>
+            </w:r>
+          </w:p>
+        </w:tc>
+        <w:tc>
+          <w:tcPr>
+            <w:tcW w:type="dxa" w:w="2160"/>
+          </w:tcPr>
+          <w:p>
+            <w:r>
+              <w:t>253</w:t>
+            </w:r>
+          </w:p>
+        </w:tc>
+        <w:tc>
+          <w:tcPr>
+            <w:tcW w:type="dxa" w:w="2160"/>
+          </w:tcPr>
+          <w:p>
+            <w:r>
+              <w:t>83</w:t>
+            </w:r>
+          </w:p>
+        </w:tc>
+        <w:tc>
+          <w:tcPr>
+            <w:tcW w:type="dxa" w:w="2160"/>
+          </w:tcPr>
+          <w:p>
+            <w:r>
+              <w:t>1622</w:t>
+            </w:r>
+          </w:p>
+        </w:tc>
+      </w:tr>
+    </w:tbl>
+    <w:p>
+      <w:pPr>
+        <w:jc w:val="both"/>
+      </w:pPr>
+      <w:r>
+        <w:t xml:space="preserve">Лог-ранг </w:t>
+      </w:r>
+      <w:r>
+        <w:rPr>
+          <w:b/>
+        </w:rPr>
+        <w:t>p = 0.275</w:t>
+      </w:r>
+      <w:r>
+        <w:t>; Cox (IGKC + возраст + стадия, n = 497): IGKC HR = 0.83, p = 0.147. Тренд защитный, но не достигает значимости: повышенная иммуноглобулиновая нагрузка слабо ассоциирована с лучшей выживаемостью, что согласуется с гуморальным иммунным микроокружением как положительным прогностическим фактором LUAD, но эффект мал относительно стадии (HR = 2.49, p &lt; 0.001 в той же модели).</w:t>
+      </w:r>
+    </w:p>
+    <w:p>
+      <w:pPr>
+        <w:jc w:val="both"/>
+      </w:pPr>
+      <w:r>
+        <w:rPr>
+          <w:b/>
+        </w:rPr>
+        <w:t>Стадия значима внутри каждого физиотипа</w:t>
+      </w:r>
+      <w:r>
+        <w:t xml:space="preserve"> (стратифицированный лог-ранг): PH1 — медианы I/II 1830 vs III/IV 711 дней, p &lt; 0.001; PH2 — 1725 vs 807, p = 0.0001; PH3 — 1288 vs 976, p = 0.027. Напротив, </w:t>
+      </w:r>
+      <w:r>
+        <w:rPr>
+          <w:b/>
+        </w:rPr>
+        <w:t>физиотип не различает выживаемость внутри стадии</w:t>
+      </w:r>
+      <w:r>
+        <w:t>: Cox в подгруппе I/II (n = 391) HR = 1.11, p = 0.47; в III/IV (n = 106) HR = 1.21, p = 0.30. Итог: прогностический сигнал физиотипов (лог-ранг p &lt; 0.001, п. 3.8) в значительной мере опосредован составом стадий внутри физиотипов, а не независимым биологическим прогнозом.</w:t>
+      </w:r>
+    </w:p>
+    <w:p>
+      <w:pPr>
+        <w:jc w:val="both"/>
+      </w:pPr>
+      <w:r>
+        <w:rPr>
+          <w:b/>
+        </w:rPr>
+        <w:t>Мутации в Cox-модели.</w:t>
+      </w:r>
+      <w:r>
+        <w:t xml:space="preserve"> К мутационному статусу присоединены EGFR (71/518, 13.7%), KRAS (140/518, 27%) и TP53 (254/518, 49%) из cBioPortal (luad_tcga_gdc). Совместная модель Cox (физиотип + возраст + стадия + EGFR + KRAS + TP53, n = 497):</w:t>
+      </w:r>
+    </w:p>
+    <w:tbl>
+      <w:tblPr>
+        <w:tblStyle w:val="LightGrid-Accent1"/>
+        <w:tblW w:type="auto" w:w="0"/>
+        <w:tblLook w:firstColumn="1" w:firstRow="1" w:lastColumn="0" w:lastRow="0" w:noHBand="0" w:noVBand="1" w:val="04A0"/>
+      </w:tblPr>
+      <w:tblGrid>
+        <w:gridCol w:w="2880"/>
+        <w:gridCol w:w="2880"/>
+        <w:gridCol w:w="2880"/>
+      </w:tblGrid>
+      <w:tr>
+        <w:tc>
+          <w:tcPr>
+            <w:tcW w:type="dxa" w:w="2880"/>
+          </w:tcPr>
+          <w:p>
+            <w:r>
+              <w:rPr>
+                <w:b/>
+              </w:rPr>
+              <w:t>Фактор</w:t>
+            </w:r>
+          </w:p>
+        </w:tc>
+        <w:tc>
+          <w:tcPr>
+            <w:tcW w:type="dxa" w:w="2880"/>
+          </w:tcPr>
+          <w:p>
+            <w:r>
+              <w:rPr>
+                <w:b/>
+              </w:rPr>
+              <w:t>HR</w:t>
+            </w:r>
+          </w:p>
+        </w:tc>
+        <w:tc>
+          <w:tcPr>
+            <w:tcW w:type="dxa" w:w="2880"/>
+          </w:tcPr>
+          <w:p>
+            <w:r>
+              <w:rPr>
+                <w:b/>
+              </w:rPr>
+              <w:t>p</w:t>
+            </w:r>
+          </w:p>
+        </w:tc>
+      </w:tr>
+      <w:tr>
+        <w:tc>
+          <w:tcPr>
+            <w:tcW w:type="dxa" w:w="2880"/>
+          </w:tcPr>
+          <w:p>
+            <w:r>
+              <w:t>Физиотип (линейный тренд)</w:t>
+            </w:r>
+          </w:p>
+        </w:tc>
+        <w:tc>
+          <w:tcPr>
+            <w:tcW w:type="dxa" w:w="2880"/>
+          </w:tcPr>
+          <w:p>
+            <w:r>
+              <w:t>1.15</w:t>
+            </w:r>
+          </w:p>
+        </w:tc>
+        <w:tc>
+          <w:tcPr>
+            <w:tcW w:type="dxa" w:w="2880"/>
+          </w:tcPr>
+          <w:p>
+            <w:r>
+              <w:t>0.22</w:t>
+            </w:r>
+          </w:p>
+        </w:tc>
+      </w:tr>
+      <w:tr>
+        <w:tc>
+          <w:tcPr>
+            <w:tcW w:type="dxa" w:w="2880"/>
+          </w:tcPr>
+          <w:p>
+            <w:r>
+              <w:t>Стадия III/IV</w:t>
+            </w:r>
+          </w:p>
+        </w:tc>
+        <w:tc>
+          <w:tcPr>
+            <w:tcW w:type="dxa" w:w="2880"/>
+          </w:tcPr>
+          <w:p>
+            <w:r>
+              <w:t>2.52</w:t>
+            </w:r>
+          </w:p>
+        </w:tc>
+        <w:tc>
+          <w:tcPr>
+            <w:tcW w:type="dxa" w:w="2880"/>
+          </w:tcPr>
+          <w:p>
+            <w:r>
+              <w:t>&lt; 0.001</w:t>
+            </w:r>
+          </w:p>
+        </w:tc>
+      </w:tr>
+      <w:tr>
+        <w:tc>
+          <w:tcPr>
+            <w:tcW w:type="dxa" w:w="2880"/>
+          </w:tcPr>
+          <w:p>
+            <w:r>
+              <w:t>KRAS</w:t>
+            </w:r>
+          </w:p>
+        </w:tc>
+        <w:tc>
+          <w:tcPr>
+            <w:tcW w:type="dxa" w:w="2880"/>
+          </w:tcPr>
+          <w:p>
+            <w:r>
+              <w:t>1.40</w:t>
+            </w:r>
+          </w:p>
+        </w:tc>
+        <w:tc>
+          <w:tcPr>
+            <w:tcW w:type="dxa" w:w="2880"/>
+          </w:tcPr>
+          <w:p>
+            <w:r>
+              <w:t>0.062</w:t>
+            </w:r>
+          </w:p>
+        </w:tc>
+      </w:tr>
+      <w:tr>
+        <w:tc>
+          <w:tcPr>
+            <w:tcW w:type="dxa" w:w="2880"/>
+          </w:tcPr>
+          <w:p>
+            <w:r>
+              <w:t>TP53</w:t>
+            </w:r>
+          </w:p>
+        </w:tc>
+        <w:tc>
+          <w:tcPr>
+            <w:tcW w:type="dxa" w:w="2880"/>
+          </w:tcPr>
+          <w:p>
+            <w:r>
+              <w:t>1.26</w:t>
+            </w:r>
+          </w:p>
+        </w:tc>
+        <w:tc>
+          <w:tcPr>
+            <w:tcW w:type="dxa" w:w="2880"/>
+          </w:tcPr>
+          <w:p>
+            <w:r>
+              <w:t>0.16</w:t>
+            </w:r>
+          </w:p>
+        </w:tc>
+      </w:tr>
+      <w:tr>
+        <w:tc>
+          <w:tcPr>
+            <w:tcW w:type="dxa" w:w="2880"/>
+          </w:tcPr>
+          <w:p>
+            <w:r>
+              <w:t>EGFR</w:t>
+            </w:r>
+          </w:p>
+        </w:tc>
+        <w:tc>
+          <w:tcPr>
+            <w:tcW w:type="dxa" w:w="2880"/>
+          </w:tcPr>
+          <w:p>
+            <w:r>
+              <w:t>1.27</w:t>
+            </w:r>
+          </w:p>
+        </w:tc>
+        <w:tc>
+          <w:tcPr>
+            <w:tcW w:type="dxa" w:w="2880"/>
+          </w:tcPr>
+          <w:p>
+            <w:r>
+              <w:t>0.26</w:t>
+            </w:r>
+          </w:p>
+        </w:tc>
+      </w:tr>
+    </w:tbl>
+    <w:p>
+      <w:pPr>
+        <w:jc w:val="both"/>
+      </w:pPr>
+      <w:r>
+        <w:t>Пограничный неблагоприятный сигнал KRAS (p = 0.06) согласуется с литературными данными о худшей выживаемости при KRAS-мутированном LUAD; физиотип и в присутствии мутаций не даёт независимого вклада.</w:t>
+      </w:r>
+    </w:p>
+    <w:p>
+      <w:pPr>
+        <w:pStyle w:val="Heading2"/>
+      </w:pPr>
+      <w:r>
+        <w:t>3.10 Устойчивость и сила топологического сигнала (перекрёстная ссылка)</w:t>
       </w:r>
     </w:p>
     <w:p>
@@ -1497,7 +2235,7 @@
         <w:pStyle w:val="Heading2"/>
       </w:pPr>
       <w:r>
-        <w:t>3.9 Путь-анализ (GSEA prerank, FDR &lt; 0.25)</w:t>
+        <w:t>3.11 Путь-анализ (GSEA prerank, FDR &lt; 0.25)</w:t>
       </w:r>
     </w:p>
     <w:p>
@@ -1540,6 +2278,76 @@
       </w:r>
       <w:r>
         <w:t xml:space="preserve"> регуляция рРНК-экспрессии (NES = 2.83), РНК-полимераза I, конденсация хромосом профазы, CENPA, сборка ORC; вниз — отторжение аллотрансплантата (−2.87), IFN-γ (−2.85), IFN-α (−2.59), TNF (−2.57).</w:t>
+      </w:r>
+    </w:p>
+    <w:p>
+      <w:pPr>
+        <w:pStyle w:val="Heading2"/>
+      </w:pPr>
+      <w:r>
+        <w:t>3.12 Внешняя валидация: GSE31210 (GPL570, микроматрицы)</w:t>
+      </w:r>
+    </w:p>
+    <w:p>
+      <w:pPr>
+        <w:jc w:val="both"/>
+      </w:pPr>
+      <w:r>
+        <w:t xml:space="preserve">Для проверки воспроизводимости физиотипирование применено к независимой когорте ранних стадий LUAD — </w:t>
+      </w:r>
+      <w:r>
+        <w:rPr>
+          <w:b/>
+        </w:rPr>
+        <w:t>GSE31210</w:t>
+      </w:r>
+      <w:r>
+        <w:t xml:space="preserve"> (GEO, 226 опухолей + 20 норм; стадии I–II; 35 OS-событий, 64 рецидива). Из-за платформенных ограничений GPL570 доступно только 313 из 500 HVG-генов; рецепт идентичен GDC: первые 200 генов в порядке variance-order, нормализация на распределение, попарные расстояния Вассерштейна, Ward k = 3. Кластеры размерами 82/83/61 отображены на GDC-физиотипы по обогащению генных модулей (z-эффект) — {1→2, 2→1, 3→3}.</w:t>
+      </w:r>
+    </w:p>
+    <w:p>
+      <w:pPr>
+        <w:jc w:val="both"/>
+      </w:pPr>
+      <w:r>
+        <w:rPr>
+          <w:b/>
+        </w:rPr>
+        <w:t>Структура воспроизводится.</w:t>
+      </w:r>
+      <w:r>
+        <w:t xml:space="preserve"> Три кластера устойчивы (bootstrap ARI = 0.684 ± 0.196, 50 подвыборок 80%); существует IG-обогащённый кластер с теми же маркёрами физиотипа 1, что и в GDC (IGKC, IGHG1, LTF, SPDEF, FDCSP, CCL19, CXCL13, CEACAM6 — 16 генов IG-сигнатуры доступны на платформе). </w:t>
+      </w:r>
+      <w:r>
+        <w:rPr>
+          <w:b/>
+        </w:rPr>
+        <w:t>Топологическая дивергенция опухоль/норма воспроизводится полностью:</w:t>
+      </w:r>
+      <w:r>
+        <w:t xml:space="preserve"> d̄_topo = 0.670, p &lt; 0.005 (199 пермутаций) — близко к GDC (0.600).</w:t>
+      </w:r>
+    </w:p>
+    <w:p>
+      <w:pPr>
+        <w:jc w:val="both"/>
+      </w:pPr>
+      <w:r>
+        <w:rPr>
+          <w:b/>
+        </w:rPr>
+        <w:t>Прогностические ассоциации не воспроизводятся.</w:t>
+      </w:r>
+      <w:r>
+        <w:t xml:space="preserve"> OS по физиотипам: p = 0.65 (12/10/13 событий на кластер, медианы не достигнуты из-за низкой мощности); RFS: p = 0.60 (23/20/21 рецидивов). IGKC-сплит: IG-high даже *хуже* IG-low (OS 20 vs 10 событий, p = 0.066 — тренд противоположен GDC), корреляция IG-скора с временем до события отсутствует (r = −0.015, p = 0.83). λ_max-модуль IGKC на GPL570 не воспроизводится: из 20 генов модуля на платформе есть только IGKC и IGHG1, верхний собственный вектор набран генами секреции/сурфактанта (CEACAM6, NAPSA, SFTPB, PIGR, C4BPA), отношение средних |loading| по IG-генам к общему — 1.08 (в GDC ~7).</w:t>
+      </w:r>
+    </w:p>
+    <w:p>
+      <w:pPr>
+        <w:jc w:val="both"/>
+      </w:pPr>
+      <w:r>
+        <w:t>Интерпретация честно фиксирует два вывода. (1) Метод (топология, Wasserstein-физиотипирование) воспроизводим на другой платформе: та же трёхкластерная структура, тот же иммуноглобулиновый кластер, та же огромная опухоль/норма дивергенция. (2) Прогностические эффекты физиотипов и IGKC не воспроизводятся на GSE31210, и причины методические, а не биологические: всего 35 OS-событий (медианы OS в когорте вообще не достигнуты), выборка ограничена стадиями I–II, GPL570 не покрывает IG-вариабельные гены (2/20 модуля), поэтому ни IGKC-сигнатура, ни IG-нагрузка λ_max в этой когорте не измеримы. Для надёжной внешней валидации прогностической ценности нужна когорта с полноразмерным транскриптомом (RNA-seq) и событиями III–IV стадий.</w:t>
       </w:r>
     </w:p>
     <w:p>
@@ -1605,7 +2413,7 @@
         <w:jc w:val="both"/>
       </w:pPr>
       <w:r>
-        <w:t>Ключевые результаты образуют целостную картину. (1) Дифференциальная экспрессия корректна по направлению, но эвристики (HVG, PC1) ей почти ортогональны — выводы о конкретных генах должны опираться на DE-анализ, а не на дисперсию. (2) Доминирующий когерентный модуль транскриптома (λ_max) — гуморальный иммунитет, что делает интерпретацию «иммунного микроокружения» центральной для LUAD-биологии. (3) Физиотипы независимы от стадии — они описывают интринсик-биологию, а не прогрессию; их ассоциация с тканью (χ² = 79.97) сочетается с частичной независимостью от статуса ткани внутри опухолей. (4) Прогностический сигнал есть (лог-ранг p &lt; 0.001), но перекрывается со стадией — требуется формальная валидация. (5) Топологический сигнал устойчив к выбору генов.</w:t>
+        <w:t>Ключевые результаты образуют целостную картину. (1) Дифференциальная экспрессия корректна по направлению, но эвристики (HVG, PC1) ей почти ортогональны — выводы о конкретных генах должны опираться на DE-анализ, а не на дисперсию. (2) Доминирующий когерентный модуль транскриптома (λ_max) — гуморальный иммунитет, что делает интерпретацию «иммунного микроокружения» центральной для LUAD-биологии. (3) Физиотипы независимы от стадии — они описывают интринсик-биологию, а не прогрессию; их ассоциация с тканью (χ² = 79.97) сочетается с частичной независимостью от статуса ткани внутри опухолей. (4) Прогностический сигнал есть (лог-ранг p &lt; 0.001) и согласуется с классическими подтипами (TRU/PI/PP, χ² = 14.44, p = 0.006; худшие по выживаемости физиотип 3 и PP совпадают), но внутри стадий физиотип не различает пациентов (HR ≈ 1.1–1.2, p &gt; 0.29), а IGKC-сигнатура даёт лишь пограничный защитный тренд (HR = 0.83, p = 0.15) — независимая прогностическая ценность не доказана и требует когорт с полным транскриптомом и поздними стадиями. (5) Топологический сигнал устойчив к выбору генов. (6) Внешняя валидация (GSE31210) подтверждает воспроизводимость метода и структуры (3 кластера, IG-кластер, d̄_topo = 0.670), но не прогностических ассоциаций — ограничения мощности и платформы (2/20 генов IGKC-модуля на GPL570) не позволяют измерить IG-сигнал на микроматрицах.</w:t>
       </w:r>
     </w:p>
     <w:p>
@@ -1613,7 +2421,7 @@
         <w:jc w:val="both"/>
       </w:pPr>
       <w:r>
-        <w:t>Ограничения: UMAP/физиотипы на 500 HVG; физиотипирование на первых 200 HVG; ARI чувствителен к дисбалансу; норма мала (59) и парна опухолям; клиника из Xena может содержать неточности стадий (межинституциональные различия AJCC); Cox-модель использует бинарную стадию; формальная внешняя валидация и воспроизводимость (train/test) — следующий этап.</w:t>
+        <w:t>Ограничения: UMAP/физиотипы на 500 HVG; физиотипирование на первых 200 HVG; ARI чувствителен к дисбалансу; норма мала (59) и парна опухолям; клиника из Xena может содержать неточности стадий (межинституциональные различия AJCC); Cox-модель использует бинарную стадию; подтипы Nature 2014 доступны лишь для 221 из 507 пациентов и основаны на RNA-seq иной генерации; внешняя валидация (GSE31210) ограничена стадиями I–II, 35 OS-событиями и отсутствием IG-вариабельных генов на GPL570; формальная train/test-валидация прогностической модели — следующий этап.</w:t>
       </w:r>
     </w:p>
     <w:p>
@@ -1669,7 +2477,23 @@
         <w:pStyle w:val="ListNumber"/>
       </w:pPr>
       <w:r>
-        <w:t>Выживаемость по физиотипам различается (лог-ранг p &lt; 0.001); худший — физиотип 3 (медиана 1171 день); после поправки на стадию тренд ослабевает.</w:t>
+        <w:t>Физиотипы согласуются с подтипами TRU/PI/PP (χ² = 14.44, p = 0.006): PH1→TRU, PH2→PI, PH3→PP; порядок выживаемости совпадает (TRU 1830 &gt; PI 1357 &gt; PP 1115 дней).</w:t>
+      </w:r>
+    </w:p>
+    <w:p>
+      <w:pPr>
+        <w:pStyle w:val="ListNumber"/>
+      </w:pPr>
+      <w:r>
+        <w:t>Выживаемость по физиотипам различается (лог-ранг p &lt; 0.001); худший — физиотип 3 (медиана 1171 день); внутри стадий физиотип незначим (I/II HR = 1.11; III/IV HR = 1.21); IGKC-сигнатура — пограничный защитный тренд (HR = 0.83, p = 0.15); мутации EGFR/KRAS/TP53 в Cox незначимы (KRAS p = 0.06).</w:t>
+      </w:r>
+    </w:p>
+    <w:p>
+      <w:pPr>
+        <w:pStyle w:val="ListNumber"/>
+      </w:pPr>
+      <w:r>
+        <w:t>Внешняя валидация (GSE31210): метод воспроизводим (3 кластера, bootstrap ARI 0.684, IG-кластер, d̄_topo = 0.670), прогностические ассоциации не воспроизведены — ограничения мощности и покрытия GPL570.</w:t>
       </w:r>
     </w:p>
     <w:p>
@@ -1876,7 +2700,7 @@
       <w:r>
         <w:drawing>
           <wp:inline xmlns:a="http://schemas.openxmlformats.org/drawingml/2006/main" xmlns:pic="http://schemas.openxmlformats.org/drawingml/2006/picture">
-            <wp:extent cx="5486400" cy="4220308"/>
+            <wp:extent cx="5486400" cy="3798277"/>
             <wp:docPr id="5" name="Picture 5"/>
             <wp:cNvGraphicFramePr>
               <a:graphicFrameLocks noChangeAspect="1"/>
@@ -1897,6 +2721,50 @@
                   <pic:spPr>
                     <a:xfrm>
                       <a:off x="0" y="0"/>
+                      <a:ext cx="5486400" cy="3798277"/>
+                    </a:xfrm>
+                    <a:prstGeom prst="rect"/>
+                  </pic:spPr>
+                </pic:pic>
+              </a:graphicData>
+            </a:graphic>
+          </wp:inline>
+        </w:drawing>
+      </w:r>
+    </w:p>
+    <w:p>
+      <w:r>
+        <w:t>Рис. 6 (figures/gdc2_survival_igkc.png) — KM: IGKC-low/high; стадии I/II vs III/IV внутри физиотипов.</w:t>
+      </w:r>
+    </w:p>
+    <w:p>
+      <w:pPr>
+        <w:jc w:val="center"/>
+      </w:pPr>
+      <w:r>
+        <w:drawing>
+          <wp:inline xmlns:a="http://schemas.openxmlformats.org/drawingml/2006/main" xmlns:pic="http://schemas.openxmlformats.org/drawingml/2006/picture">
+            <wp:extent cx="5486400" cy="4220308"/>
+            <wp:docPr id="6" name="Picture 6"/>
+            <wp:cNvGraphicFramePr>
+              <a:graphicFrameLocks noChangeAspect="1"/>
+            </wp:cNvGraphicFramePr>
+            <a:graphic>
+              <a:graphicData uri="http://schemas.openxmlformats.org/drawingml/2006/picture">
+                <pic:pic>
+                  <pic:nvPicPr>
+                    <pic:cNvPr id="0" name="gdc2_survival_igkc.png"/>
+                    <pic:cNvPicPr/>
+                  </pic:nvPicPr>
+                  <pic:blipFill>
+                    <a:blip r:embed="rId14"/>
+                    <a:stretch>
+                      <a:fillRect/>
+                    </a:stretch>
+                  </pic:blipFill>
+                  <pic:spPr>
+                    <a:xfrm>
+                      <a:off x="0" y="0"/>
                       <a:ext cx="5486400" cy="4220308"/>
                     </a:xfrm>
                     <a:prstGeom prst="rect"/>
@@ -1910,7 +2778,7 @@
     </w:p>
     <w:p>
       <w:r>
-        <w:t>Рис. 6 (figures/gdc2_tda.png) — кривые Бетти-0 опухоль/норма (из сопутствующей статьи).</w:t>
+        <w:t>Рис. 7 (figures/gdc2_subtypes_survival.png) — KM-кривые OS по подтипам TRU/PI/PP.</w:t>
       </w:r>
     </w:p>
     <w:p>
@@ -1920,8 +2788,140 @@
       <w:r>
         <w:drawing>
           <wp:inline xmlns:a="http://schemas.openxmlformats.org/drawingml/2006/main" xmlns:pic="http://schemas.openxmlformats.org/drawingml/2006/picture">
-            <wp:extent cx="5486400" cy="3657600"/>
-            <wp:docPr id="6" name="Picture 6"/>
+            <wp:extent cx="5486400" cy="4220308"/>
+            <wp:docPr id="7" name="Picture 7"/>
+            <wp:cNvGraphicFramePr>
+              <a:graphicFrameLocks noChangeAspect="1"/>
+            </wp:cNvGraphicFramePr>
+            <a:graphic>
+              <a:graphicData uri="http://schemas.openxmlformats.org/drawingml/2006/picture">
+                <pic:pic>
+                  <pic:nvPicPr>
+                    <pic:cNvPr id="0" name="gdc2_subtypes_survival.png"/>
+                    <pic:cNvPicPr/>
+                  </pic:nvPicPr>
+                  <pic:blipFill>
+                    <a:blip r:embed="rId15"/>
+                    <a:stretch>
+                      <a:fillRect/>
+                    </a:stretch>
+                  </pic:blipFill>
+                  <pic:spPr>
+                    <a:xfrm>
+                      <a:off x="0" y="0"/>
+                      <a:ext cx="5486400" cy="4220308"/>
+                    </a:xfrm>
+                    <a:prstGeom prst="rect"/>
+                  </pic:spPr>
+                </pic:pic>
+              </a:graphicData>
+            </a:graphic>
+          </wp:inline>
+        </w:drawing>
+      </w:r>
+    </w:p>
+    <w:p>
+      <w:r>
+        <w:t>Рис. 8 (figures/geo_validate_physio.png) — GSE31210: KM OS/RFS по GEO-физиотипам.</w:t>
+      </w:r>
+    </w:p>
+    <w:p>
+      <w:pPr>
+        <w:jc w:val="center"/>
+      </w:pPr>
+      <w:r>
+        <w:drawing>
+          <wp:inline xmlns:a="http://schemas.openxmlformats.org/drawingml/2006/main" xmlns:pic="http://schemas.openxmlformats.org/drawingml/2006/picture">
+            <wp:extent cx="5486400" cy="3918857"/>
+            <wp:docPr id="8" name="Picture 8"/>
+            <wp:cNvGraphicFramePr>
+              <a:graphicFrameLocks noChangeAspect="1"/>
+            </wp:cNvGraphicFramePr>
+            <a:graphic>
+              <a:graphicData uri="http://schemas.openxmlformats.org/drawingml/2006/picture">
+                <pic:pic>
+                  <pic:nvPicPr>
+                    <pic:cNvPr id="0" name="geo_validate_physio.png"/>
+                    <pic:cNvPicPr/>
+                  </pic:nvPicPr>
+                  <pic:blipFill>
+                    <a:blip r:embed="rId16"/>
+                    <a:stretch>
+                      <a:fillRect/>
+                    </a:stretch>
+                  </pic:blipFill>
+                  <pic:spPr>
+                    <a:xfrm>
+                      <a:off x="0" y="0"/>
+                      <a:ext cx="5486400" cy="3918857"/>
+                    </a:xfrm>
+                    <a:prstGeom prst="rect"/>
+                  </pic:spPr>
+                </pic:pic>
+              </a:graphicData>
+            </a:graphic>
+          </wp:inline>
+        </w:drawing>
+      </w:r>
+    </w:p>
+    <w:p>
+      <w:r>
+        <w:t>Рис. 9 (figures/geo_validate_ig_high.png) — GSE31210: KM IG-high vs IG-low.</w:t>
+      </w:r>
+    </w:p>
+    <w:p>
+      <w:pPr>
+        <w:jc w:val="center"/>
+      </w:pPr>
+      <w:r>
+        <w:drawing>
+          <wp:inline xmlns:a="http://schemas.openxmlformats.org/drawingml/2006/main" xmlns:pic="http://schemas.openxmlformats.org/drawingml/2006/picture">
+            <wp:extent cx="5486400" cy="3918857"/>
+            <wp:docPr id="9" name="Picture 9"/>
+            <wp:cNvGraphicFramePr>
+              <a:graphicFrameLocks noChangeAspect="1"/>
+            </wp:cNvGraphicFramePr>
+            <a:graphic>
+              <a:graphicData uri="http://schemas.openxmlformats.org/drawingml/2006/picture">
+                <pic:pic>
+                  <pic:nvPicPr>
+                    <pic:cNvPr id="0" name="geo_validate_ig_high.png"/>
+                    <pic:cNvPicPr/>
+                  </pic:nvPicPr>
+                  <pic:blipFill>
+                    <a:blip r:embed="rId17"/>
+                    <a:stretch>
+                      <a:fillRect/>
+                    </a:stretch>
+                  </pic:blipFill>
+                  <pic:spPr>
+                    <a:xfrm>
+                      <a:off x="0" y="0"/>
+                      <a:ext cx="5486400" cy="3918857"/>
+                    </a:xfrm>
+                    <a:prstGeom prst="rect"/>
+                  </pic:spPr>
+                </pic:pic>
+              </a:graphicData>
+            </a:graphic>
+          </wp:inline>
+        </w:drawing>
+      </w:r>
+    </w:p>
+    <w:p>
+      <w:r>
+        <w:t>Рис. 10 (figures/gdc2_tda.png) — кривые Бетти-0 опухоль/норма (из сопутствующей статьи).</w:t>
+      </w:r>
+    </w:p>
+    <w:p>
+      <w:pPr>
+        <w:jc w:val="center"/>
+      </w:pPr>
+      <w:r>
+        <w:drawing>
+          <wp:inline xmlns:a="http://schemas.openxmlformats.org/drawingml/2006/main" xmlns:pic="http://schemas.openxmlformats.org/drawingml/2006/picture">
+            <wp:extent cx="5486400" cy="3798277"/>
+            <wp:docPr id="10" name="Picture 10"/>
             <wp:cNvGraphicFramePr>
               <a:graphicFrameLocks noChangeAspect="1"/>
             </wp:cNvGraphicFramePr>
@@ -1933,7 +2933,7 @@
                     <pic:cNvPicPr/>
                   </pic:nvPicPr>
                   <pic:blipFill>
-                    <a:blip r:embed="rId14"/>
+                    <a:blip r:embed="rId18"/>
                     <a:stretch>
                       <a:fillRect/>
                     </a:stretch>
@@ -1941,7 +2941,7 @@
                   <pic:spPr>
                     <a:xfrm>
                       <a:off x="0" y="0"/>
-                      <a:ext cx="5486400" cy="3657600"/>
+                      <a:ext cx="5486400" cy="3798277"/>
                     </a:xfrm>
                     <a:prstGeom prst="rect"/>
                   </pic:spPr>
@@ -2029,7 +3029,47 @@
         <w:jc w:val="both"/>
       </w:pPr>
       <w:r>
-        <w:t>python scripts\gdc2_survival.py          # KM + Cox</w:t>
+        <w:t>python scripts\gdc2_survival.py          # KM + Cox по физиотипам</w:t>
+      </w:r>
+    </w:p>
+    <w:p>
+      <w:pPr>
+        <w:jc w:val="both"/>
+      </w:pPr>
+      <w:r>
+        <w:t>python scripts\gdc2_survival_igkc.py     # IGKC-сигнатура, стадии внутри физиотипов, мутации</w:t>
+      </w:r>
+    </w:p>
+    <w:p>
+      <w:pPr>
+        <w:jc w:val="both"/>
+      </w:pPr>
+      <w:r>
+        <w:t>python scripts\gdc2_subtypes.py          # подтипы TRU/PI/PP (Nature 2014) vs физиотипы</w:t>
+      </w:r>
+    </w:p>
+    <w:p>
+      <w:pPr>
+        <w:jc w:val="both"/>
+      </w:pPr>
+      <w:r>
+        <w:t>python scripts\fetch_geo_gse31210.py     # GSE31210: загрузка + клиника + экспрессия</w:t>
+      </w:r>
+    </w:p>
+    <w:p>
+      <w:pPr>
+        <w:jc w:val="both"/>
+      </w:pPr>
+      <w:r>
+        <w:t>python scripts\geo_validate.py           # внешняя валидация физиотипов на GSE31210</w:t>
+      </w:r>
+    </w:p>
+    <w:p>
+      <w:pPr>
+        <w:jc w:val="both"/>
+      </w:pPr>
+      <w:r>
+        <w:t>python scripts\gdc2_figures_bw.py        # ч/б-стили рис. 5, 6, 7 (KM-кривые)</w:t>
       </w:r>
     </w:p>
     <w:p>
@@ -2045,7 +3085,16 @@
         <w:jc w:val="both"/>
       </w:pPr>
       <w:r>
-        <w:t>Результаты: `results/gdc_deseq2.csv`, `results/gdc2_cmp_deseq2.json`, `results/gdc2_umap.json`, `results/gdc2_physiotype_top50_genes.csv`, `results/gdc2_gsea.csv`, `results/gdc2_gsea_ora.csv`, `results/gdc2_robustness.json`, `results/gdc2_lmax.json`, `results/gdc2_clinical.json`, `results/gdc2_survival.json`; данные — `data/processed/gdc2_clinical_xena.tsv`, `gdc2_clinical_merged.csv`; рисунки — `figures/gdc2_*.png`. Репозиторий: `https://github.com/mordvinov-arch/topo-stress`.</w:t>
+        <w:t>Результаты: `results/gdc_deseq2.csv`, `results/gdc2_cmp_deseq2.json`, `results/gdc2_umap.json`, `results/gdc2_physiotype_top50_genes.csv`, `results/gdc2_gsea.csv`, `results/gdc2_gsea_ora.csv`, `results/gdc2_robustness.json`, `results/gdc2_lmax.json`, `results/gdc2_clinical.json`, `results/gdc2_survival.json`, `results/gdc2_survival_igkc.json`, `results/gdc2_subtypes.json`, `results/geo_validate.json`; данные — `data/processed/gdc2_clinical_xena.tsv`, `gdc2_clinical_merged.csv`, `tcga2014_subtypes.csv`, `gse31210_expression.csv`, `gse31210_clinical.csv`; рисунки — `figures/gdc2_</w:t>
+      </w:r>
+      <w:r>
+        <w:rPr>
+          <w:i/>
+        </w:rPr>
+        <w:t>.png`, `figures/geo_validate_</w:t>
+      </w:r>
+      <w:r>
+        <w:t>.png`. Репозиторий: `https://github.com/mordvinov-arch/topo-stress`.</w:t>
       </w:r>
     </w:p>
     <w:sectPr>

</xml_diff>

<commit_message>
Add TCGA-LUAD physiotype OS validation suite (GDC2): train/test stability, nomogram, deconvolution, gene panel + GEO validation, known signatures (Hypoxia/B-cell/Proliferation), TMB, histology, checkpoint/ESTIMATE; honest audit fixes (checkpoint=PH1, histology HRs, patient-level survival, corrected p-values); updated manuscript + figures
</commit_message>
<xml_diff>
--- a/article/gdc_article_biology.docx
+++ b/article/gdc_article_biology.docx
@@ -50,7 +50,7 @@
         <w:t>иммуноглобулиновый модуль</w:t>
       </w:r>
       <w:r>
-        <w:t xml:space="preserve"> (IGKC, IGKV3-20, IGKV1-5, IGLC2, IGHV…): доминирующий когерентный фактор транскриптома — B-клеточная/плазмоклеточная инфильтрация. Выживаемость по физиотипам (tumor-only, пациенты): log-rank p &lt; 0.001; медиана OS физиотипа 3 (иммунно-холодного, пролиферативного) — 1171 день против ≈ 1500 у физиотипов 1–2; после поправки на стадию и возраст тренд ослабевает (стадия: HR = 2.56, p &lt; 0.001). IGKC-сигнатура (20 генов λ_max-модуля, медианный сплит) даёт пограничный защитный тренд (HR = 0.83, p = 0.15), а внутри стадий физиотип не различает выживаемость (HR = 1.1–1.2). Физиотипы согласуются с классическими подтипами TRU/PI/PP (χ² = 14.44, p = 0.006): PH1→TRU, PH2→PI, PH3→PP; порядок выживаемости по подтипам совпадает (TRU 1830 &gt; PI 1357 &gt; PP 1115 дней). Внешняя валидация (GSE31210, 226 опухолей) воспроизводит структуру физиотипов (bootstrap ARI 0.684, IG-кластер) и опухоль/норма-дивергенцию (d̄_topo = 0.670, p &lt; 0.005), но не прогностические ассоциации — ограничения мощности (35 OS-событий) и покрытия GPL570 (2/20 генов IGKC-модуля). Предложены биологические названия физиотипов: 1 — «стромально-гликолитический (ECM/EMT + IgA)», 2 — «обонятельно-рецепторный / слабо-стромальный», 3 — «биосинтетически-пролиферативный, иммунно-холодный».</w:t>
+        <w:t xml:space="preserve"> (IGKC, IGKV3-20, IGKV1-5, IGLC2, IGHV…): доминирующий когерентный фактор транскриптома — B-клеточная/плазмоклеточная инфильтрация. Выживаемость по физиотипам (tumor-only, пациенты): log-rank p &lt; 0.001; медиана OS физиотипа 3 (иммунно-холодного, пролиферативного) — 1171 день против ≈ 1500 у физиотипов 1–2; после поправки на стадию и возраст тренд ослабевает (стадия: HR = 2.56, p &lt; 0.001). IGKC-сигнатура (20 генов λ_max-модуля, медианный сплит) даёт пограничный защитный тренд (HR = 0.83, p = 0.15), а внутри стадий физиотип не различает выживаемость (HR = 1.1–1.2). Физиотипы согласуются с классическими подтипами TRU/PI/PP (χ² = 14.44, p = 0.006): PH1→TRU, PH2→PI, PH3→PP; порядок выживаемости по подтипам совпадает (TRU 1830 &gt; PI 1357 &gt; PP 1115 дней). Внешняя валидация (GSE31210, 226 опухолей) воспроизводит структуру физиотипов (bootstrap ARI 0.684, IG-кластер) и опухоль/норма-дивергенцию (d̄_topo = 0.670, p &lt; 0.005), но не прогностические ассоциации — ограничения мощности (35 OS-событий) и покрытия GPL570 (2/20 генов IGKC-модуля). Предложены биологические названия физиотипов: 1 — «стромально-гликолитический (ECM/EMT + IgA)», 2 — «обонятельно-рецепторный / слабо-стромальный», 3 — «биосинтетически-пролиферативный, иммунно-холодный». Дополнительные клинические инструменты (раздел 7): супервизорный классификатор обобщает физиотипы у новых пациентов (test ARI 0.44–0.59, accuracy 0.78–0.84), а безнадзорный перенос центроидов коллапсирует; лучшая прогностическая модель — номограмма «клиника + физиотип + иммунные скоры» (тест C-index 0.640, полный 0.741). Комбинация IGKC×TMB стратифицирует OS (лог-ранг крайних групп p = 0.028), гистология слабо связана с физиотипами (χ² = 29.0, p = 0.048, V = 0.17). Среди известных сигнатур сильнейший прогнозный маркер — гипоксия (Buffa): лог-ранг p = 0.0003, HR 1.75 (p &lt; 0.0001) после поправки; B-клеточная инфильтрация протективна (HR 0.76), пролиферация неблагоприятна (HR 1.34).</w:t>
       </w:r>
     </w:p>
     <w:p>
@@ -2509,6 +2509,1054 @@
         <w:pStyle w:val="Heading1"/>
       </w:pPr>
       <w:r>
+        <w:t>7. Клинические инструменты и дополнительные проверки (gdc2)</w:t>
+      </w:r>
+    </w:p>
+    <w:p>
+      <w:pPr>
+        <w:jc w:val="both"/>
+      </w:pPr>
+      <w:r>
+        <w:t>Ниже — результаты формальной train/test-валидации и клинических инструментов, добавленных поверх анализа выше.</w:t>
+      </w:r>
+    </w:p>
+    <w:p>
+      <w:pPr>
+        <w:pStyle w:val="Heading2"/>
+      </w:pPr>
+      <w:r>
+        <w:t>7.1 Train/test: безнадзорное присвоение коллапсирует, супервизорный RF обобщает</w:t>
+      </w:r>
+    </w:p>
+    <w:p>
+      <w:pPr>
+        <w:jc w:val="both"/>
+      </w:pPr>
+      <w:r>
+        <w:t xml:space="preserve">Протокол из `gdc2_train_test.py`: 5 стратифицированных сплитов 70/30 (по событиям и физиотипам). Безнадзорное присвоение тестовых образцов по ближайшему Вассерштейн-центроиду </w:t>
+      </w:r>
+      <w:r>
+        <w:rPr>
+          <w:b/>
+        </w:rPr>
+        <w:t>коллапсирует</w:t>
+      </w:r>
+      <w:r>
+        <w:t xml:space="preserve"> — 177–182 из 182 тестовых образцов попадают в один кластер (test ARI ≈ 0): центроиды в исходном 200-HVG-пространстве не разделяют физиотипы у новых образцов. Супервизорный RandomForest на тех же 200 HVG обобщает: test ARI 0.44–0.59, accuracy 0.78–0.84. Вывод: для предсказания физиотипа у нового пациента нужен обученный классификатор, а не перенос кластеризации.</w:t>
+      </w:r>
+    </w:p>
+    <w:p>
+      <w:pPr>
+        <w:pStyle w:val="Heading2"/>
+      </w:pPr>
+      <w:r>
+        <w:t>7.2 Исправление бага возраста</w:t>
+      </w:r>
+    </w:p>
+    <w:p>
+      <w:pPr>
+        <w:jc w:val="both"/>
+      </w:pPr>
+      <w:r>
+        <w:t>В `gdc2_clinical_merged.csv` возраст уже в годах (33–88, медиана 65), но 5 скриптов делили его на 365.25 (артефакт HR возраста ≈ 157). Исправлено во всех скриптах; после фикса возраст в Cox: HR = 1.014, p = 0.079.</w:t>
+      </w:r>
+    </w:p>
+    <w:p>
+      <w:pPr>
+        <w:pStyle w:val="Heading2"/>
+      </w:pPr>
+      <w:r>
+        <w:t>7.3 Номограмма (gdc2_nomogram.py)</w:t>
+      </w:r>
+    </w:p>
+    <w:p>
+      <w:pPr>
+        <w:jc w:val="both"/>
+      </w:pPr>
+      <w:r>
+        <w:t>Повторная стратифицированная 70/30 CV (10 сидов) для четырёх моделей (C-index тест, mean ± sd):</w:t>
+      </w:r>
+    </w:p>
+    <w:tbl>
+      <w:tblPr>
+        <w:tblStyle w:val="LightGrid-Accent1"/>
+        <w:tblW w:type="auto" w:w="0"/>
+        <w:tblLook w:firstColumn="1" w:firstRow="1" w:lastColumn="0" w:lastRow="0" w:noHBand="0" w:noVBand="1" w:val="04A0"/>
+      </w:tblPr>
+      <w:tblGrid>
+        <w:gridCol w:w="2880"/>
+        <w:gridCol w:w="2880"/>
+        <w:gridCol w:w="2880"/>
+      </w:tblGrid>
+      <w:tr>
+        <w:tc>
+          <w:tcPr>
+            <w:tcW w:type="dxa" w:w="2880"/>
+          </w:tcPr>
+          <w:p>
+            <w:r>
+              <w:rPr>
+                <w:b/>
+              </w:rPr>
+              <w:t>Модель</w:t>
+            </w:r>
+          </w:p>
+        </w:tc>
+        <w:tc>
+          <w:tcPr>
+            <w:tcW w:type="dxa" w:w="2880"/>
+          </w:tcPr>
+          <w:p>
+            <w:r>
+              <w:rPr>
+                <w:b/>
+              </w:rPr>
+              <w:t>Предикторы</w:t>
+            </w:r>
+          </w:p>
+        </w:tc>
+        <w:tc>
+          <w:tcPr>
+            <w:tcW w:type="dxa" w:w="2880"/>
+          </w:tcPr>
+          <w:p>
+            <w:r>
+              <w:rPr>
+                <w:b/>
+              </w:rPr>
+              <w:t>C-index тест</w:t>
+            </w:r>
+          </w:p>
+        </w:tc>
+      </w:tr>
+      <w:tr>
+        <w:tc>
+          <w:tcPr>
+            <w:tcW w:type="dxa" w:w="2880"/>
+          </w:tcPr>
+          <w:p>
+            <w:r>
+              <w:t>M1</w:t>
+            </w:r>
+          </w:p>
+        </w:tc>
+        <w:tc>
+          <w:tcPr>
+            <w:tcW w:type="dxa" w:w="2880"/>
+          </w:tcPr>
+          <w:p>
+            <w:r>
+              <w:t>возраст + стадия + физиотип</w:t>
+            </w:r>
+          </w:p>
+        </w:tc>
+        <w:tc>
+          <w:tcPr>
+            <w:tcW w:type="dxa" w:w="2880"/>
+          </w:tcPr>
+          <w:p>
+            <w:r>
+              <w:t>0.602 ± 0.035</w:t>
+            </w:r>
+          </w:p>
+        </w:tc>
+      </w:tr>
+      <w:tr>
+        <w:tc>
+          <w:tcPr>
+            <w:tcW w:type="dxa" w:w="2880"/>
+          </w:tcPr>
+          <w:p>
+            <w:r>
+              <w:t>M2</w:t>
+            </w:r>
+          </w:p>
+        </w:tc>
+        <w:tc>
+          <w:tcPr>
+            <w:tcW w:type="dxa" w:w="2880"/>
+          </w:tcPr>
+          <w:p>
+            <w:r>
+              <w:t>M1 + IGKC + TMB</w:t>
+            </w:r>
+          </w:p>
+        </w:tc>
+        <w:tc>
+          <w:tcPr>
+            <w:tcW w:type="dxa" w:w="2880"/>
+          </w:tcPr>
+          <w:p>
+            <w:r>
+              <w:t>0.596 ± 0.032</w:t>
+            </w:r>
+          </w:p>
+        </w:tc>
+      </w:tr>
+      <w:tr>
+        <w:tc>
+          <w:tcPr>
+            <w:tcW w:type="dxa" w:w="2880"/>
+          </w:tcPr>
+          <w:p>
+            <w:r>
+              <w:t>M3</w:t>
+            </w:r>
+          </w:p>
+        </w:tc>
+        <w:tc>
+          <w:tcPr>
+            <w:tcW w:type="dxa" w:w="2880"/>
+          </w:tcPr>
+          <w:p>
+            <w:r>
+              <w:t>M1 + иммунные скоры (B_cells, Cytotoxic, Fibroblasts, EMT)</w:t>
+            </w:r>
+          </w:p>
+        </w:tc>
+        <w:tc>
+          <w:tcPr>
+            <w:tcW w:type="dxa" w:w="2880"/>
+          </w:tcPr>
+          <w:p>
+            <w:r>
+              <w:t>0.640 ± 0.020</w:t>
+            </w:r>
+          </w:p>
+        </w:tc>
+      </w:tr>
+      <w:tr>
+        <w:tc>
+          <w:tcPr>
+            <w:tcW w:type="dxa" w:w="2880"/>
+          </w:tcPr>
+          <w:p>
+            <w:r>
+              <w:t>M4</w:t>
+            </w:r>
+          </w:p>
+        </w:tc>
+        <w:tc>
+          <w:tcPr>
+            <w:tcW w:type="dxa" w:w="2880"/>
+          </w:tcPr>
+          <w:p>
+            <w:r>
+              <w:t>LASSO по 500 HVG</w:t>
+            </w:r>
+          </w:p>
+        </w:tc>
+        <w:tc>
+          <w:tcPr>
+            <w:tcW w:type="dxa" w:w="2880"/>
+          </w:tcPr>
+          <w:p>
+            <w:r>
+              <w:t>0.592 ± 0.043</w:t>
+            </w:r>
+          </w:p>
+        </w:tc>
+      </w:tr>
+    </w:tbl>
+    <w:p>
+      <w:pPr>
+        <w:jc w:val="both"/>
+      </w:pPr>
+      <w:r>
+        <w:t>Лучшая — M3: добавление иммунного микроокружения улучшает дискриминацию относительно чистой клиники; TMB и IGKC её не улучшают. Номограмма: парсимоничный CoxPH (12 предикторов: возраст, стадия III/IV, PH2, PH3, IGKC_z, TMB_log + 6 генов — CCL20, DKK1, SFTPB, IGKV1-8, LINC02866, CPS1), C-index на полных данных 0.741, калибровка на 5 лет (децили). Выход: `results/gdc2_nomogram.json`, `figures/gdc2_nomogram.png`, `gdc2_nomogram_calibration.png`, `gdc2_nomogram_survival_scale.png`.</w:t>
+      </w:r>
+    </w:p>
+    <w:p>
+      <w:pPr>
+        <w:pStyle w:val="Heading2"/>
+      </w:pPr>
+      <w:r>
+        <w:t>7.4 Комбинированные биомаркёры IGKC × TMB</w:t>
+      </w:r>
+    </w:p>
+    <w:p>
+      <w:pPr>
+        <w:jc w:val="both"/>
+      </w:pPr>
+      <w:r>
+        <w:t>IGKC (20 генов λ_max-модуля, медианный сплит) и TMB (порог FDA 10 mut/Mb) почти независимы (χ² = 0.83, p = 0.36). 2×2 группы стратифицируют OS: IGKC+TMB+ (n = 73) медиана 2617 дней против IGKC−TMB− (n = 176) 1235 дней (лог-ранг крайних групп p = 0.028). Cox с возрастом и стадией: TMB_hi HR = 0.62 (p = 0.012), IGKC_hi незначим. Held-out C-index: IGKC 0.615, TMB 0.593, сумма 0.600, модель с взаимодействием 0.624 — комбинация добавляет небольшой прирост сверх каждого маркера.</w:t>
+      </w:r>
+    </w:p>
+    <w:p>
+      <w:pPr>
+        <w:pStyle w:val="Heading2"/>
+      </w:pPr>
+      <w:r>
+        <w:t>7.5 Гистология (Xena) vs физиотипы</w:t>
+      </w:r>
+    </w:p>
+    <w:p>
+      <w:pPr>
+        <w:jc w:val="both"/>
+      </w:pPr>
+      <w:r>
+        <w:t>`gdc_clinical_xena.tsv` даёт гистологические подтипы (12 категорий → IASLC-маппинг). Распределение сильно скошено: NOS 303/507, Mixed 107, Acinar 24, Papillary 21; агрессивных Solid всего 5 и Micropapillary 3 — гипотезу «solid = плохой прогноз» проверить невозможно из-за мощности. Ассоциация физиотип × гистология слабая (χ² = 29.04, p = 0.048, Cramér's V = 0.17); классификатор «только гистология» не бьёт baseline (accuracy 0.647 vs 0.645) — гистология не заменяет RNA-физиотипирование. Cox (reference NOS, возраст+стадия): относительно NOS крупные подтипы трендуют к лучшей OS — Papillary HR = 0.48 (p = 0.048), Acinar HR = 0.42 (p = 0.053), Mixed HR = 0.73 (p = 0.073); медианная OS наименьшая у NOS (1229 дн.) против Mixed 1725 дн. и Papillary 2681 дн.; C-index 0.664.</w:t>
+      </w:r>
+    </w:p>
+    <w:p>
+      <w:pPr>
+        <w:pStyle w:val="Heading2"/>
+      </w:pPr>
+      <w:r>
+        <w:t>7.6 Панель генов 20–50 (gdc2_gene_panel.py)</w:t>
+      </w:r>
+    </w:p>
+    <w:p>
+      <w:pPr>
+        <w:jc w:val="both"/>
+      </w:pPr>
+      <w:r>
+        <w:t>Вложенная CV (гены отбираются по ANOVA F только на обучающей части, RF):</w:t>
+      </w:r>
+    </w:p>
+    <w:tbl>
+      <w:tblPr>
+        <w:tblStyle w:val="LightGrid-Accent1"/>
+        <w:tblW w:type="auto" w:w="0"/>
+        <w:tblLook w:firstColumn="1" w:firstRow="1" w:lastColumn="0" w:lastRow="0" w:noHBand="0" w:noVBand="1" w:val="04A0"/>
+      </w:tblPr>
+      <w:tblGrid>
+        <w:gridCol w:w="2880"/>
+        <w:gridCol w:w="2880"/>
+        <w:gridCol w:w="2880"/>
+      </w:tblGrid>
+      <w:tr>
+        <w:tc>
+          <w:tcPr>
+            <w:tcW w:type="dxa" w:w="2880"/>
+          </w:tcPr>
+          <w:p>
+            <w:r>
+              <w:rPr>
+                <w:b/>
+              </w:rPr>
+              <w:t>Панель</w:t>
+            </w:r>
+          </w:p>
+        </w:tc>
+        <w:tc>
+          <w:tcPr>
+            <w:tcW w:type="dxa" w:w="2880"/>
+          </w:tcPr>
+          <w:p>
+            <w:r>
+              <w:rPr>
+                <w:b/>
+              </w:rPr>
+              <w:t>Accuracy (CV)</w:t>
+            </w:r>
+          </w:p>
+        </w:tc>
+        <w:tc>
+          <w:tcPr>
+            <w:tcW w:type="dxa" w:w="2880"/>
+          </w:tcPr>
+          <w:p>
+            <w:r>
+              <w:rPr>
+                <w:b/>
+              </w:rPr>
+              <w:t>ARI</w:t>
+            </w:r>
+          </w:p>
+        </w:tc>
+      </w:tr>
+      <w:tr>
+        <w:tc>
+          <w:tcPr>
+            <w:tcW w:type="dxa" w:w="2880"/>
+          </w:tcPr>
+          <w:p>
+            <w:r>
+              <w:t>K = 20</w:t>
+            </w:r>
+          </w:p>
+        </w:tc>
+        <w:tc>
+          <w:tcPr>
+            <w:tcW w:type="dxa" w:w="2880"/>
+          </w:tcPr>
+          <w:p>
+            <w:r>
+              <w:t>0.767 ± 0.011</w:t>
+            </w:r>
+          </w:p>
+        </w:tc>
+        <w:tc>
+          <w:tcPr>
+            <w:tcW w:type="dxa" w:w="2880"/>
+          </w:tcPr>
+          <w:p>
+            <w:r>
+              <w:t>0.417</w:t>
+            </w:r>
+          </w:p>
+        </w:tc>
+      </w:tr>
+      <w:tr>
+        <w:tc>
+          <w:tcPr>
+            <w:tcW w:type="dxa" w:w="2880"/>
+          </w:tcPr>
+          <w:p>
+            <w:r>
+              <w:t>K = 30</w:t>
+            </w:r>
+          </w:p>
+        </w:tc>
+        <w:tc>
+          <w:tcPr>
+            <w:tcW w:type="dxa" w:w="2880"/>
+          </w:tcPr>
+          <w:p>
+            <w:r>
+              <w:t>0.778 ± 0.009</w:t>
+            </w:r>
+          </w:p>
+        </w:tc>
+        <w:tc>
+          <w:tcPr>
+            <w:tcW w:type="dxa" w:w="2880"/>
+          </w:tcPr>
+          <w:p>
+            <w:r>
+              <w:t>0.445</w:t>
+            </w:r>
+          </w:p>
+        </w:tc>
+      </w:tr>
+      <w:tr>
+        <w:tc>
+          <w:tcPr>
+            <w:tcW w:type="dxa" w:w="2880"/>
+          </w:tcPr>
+          <w:p>
+            <w:r>
+              <w:t>K = 40</w:t>
+            </w:r>
+          </w:p>
+        </w:tc>
+        <w:tc>
+          <w:tcPr>
+            <w:tcW w:type="dxa" w:w="2880"/>
+          </w:tcPr>
+          <w:p>
+            <w:r>
+              <w:t>0.780 ± 0.011</w:t>
+            </w:r>
+          </w:p>
+        </w:tc>
+        <w:tc>
+          <w:tcPr>
+            <w:tcW w:type="dxa" w:w="2880"/>
+          </w:tcPr>
+          <w:p>
+            <w:r>
+              <w:t>0.451</w:t>
+            </w:r>
+          </w:p>
+        </w:tc>
+      </w:tr>
+      <w:tr>
+        <w:tc>
+          <w:tcPr>
+            <w:tcW w:type="dxa" w:w="2880"/>
+          </w:tcPr>
+          <w:p>
+            <w:r>
+              <w:t>K = 50</w:t>
+            </w:r>
+          </w:p>
+        </w:tc>
+        <w:tc>
+          <w:tcPr>
+            <w:tcW w:type="dxa" w:w="2880"/>
+          </w:tcPr>
+          <w:p>
+            <w:r>
+              <w:t>0.793 ± 0.008</w:t>
+            </w:r>
+          </w:p>
+        </w:tc>
+        <w:tc>
+          <w:tcPr>
+            <w:tcW w:type="dxa" w:w="2880"/>
+          </w:tcPr>
+          <w:p>
+            <w:r>
+              <w:t>0.480</w:t>
+            </w:r>
+          </w:p>
+        </w:tc>
+      </w:tr>
+      <w:tr>
+        <w:tc>
+          <w:tcPr>
+            <w:tcW w:type="dxa" w:w="2880"/>
+          </w:tcPr>
+          <w:p>
+            <w:r>
+              <w:t>Полные 500 HVG</w:t>
+            </w:r>
+          </w:p>
+        </w:tc>
+        <w:tc>
+          <w:tcPr>
+            <w:tcW w:type="dxa" w:w="2880"/>
+          </w:tcPr>
+          <w:p>
+            <w:r>
+              <w:t>0.803 ± 0.016</w:t>
+            </w:r>
+          </w:p>
+        </w:tc>
+        <w:tc>
+          <w:tcPr>
+            <w:tcW w:type="dxa" w:w="2880"/>
+          </w:tcPr>
+          <w:p>
+            <w:r>
+              <w:t>0.519</w:t>
+            </w:r>
+          </w:p>
+        </w:tc>
+      </w:tr>
+    </w:tbl>
+    <w:p>
+      <w:pPr>
+        <w:jc w:val="both"/>
+      </w:pPr>
+      <w:r>
+        <w:t>Кросс-платформенная панель (только 313 генов, измеряемых и в TCGA, и в GSE31210): K = 50 → 0.784 ± 0.006. Внешняя валидация GSE31210 честно негативная: прямой перенос обученного RF на z-скор микромассива коллапсирует (все 204 образца → PH3) из-за платформенного сдвига; устойчивое назначение по максимальной корреляции с центроидом даёт невырожденное распределение (PH1/2/3 = 63/88/53), но значимой стратификации OS нет (multivariate log-rank p = 0.40; всего 30 OS-событий). Вывод: панель воспроизводит физиотипы внутри платформы; кросс-платформенная валидация требует когорты с большим числом событий и batch-коррекции.</w:t>
+      </w:r>
+    </w:p>
+    <w:p>
+      <w:pPr>
+        <w:pStyle w:val="Heading2"/>
+      </w:pPr>
+      <w:r>
+        <w:t>7.7 Деконволюция в доли (NNLS, 10 типов клеток)</w:t>
+      </w:r>
+    </w:p>
+    <w:p>
+      <w:pPr>
+        <w:jc w:val="both"/>
+      </w:pPr>
+      <w:r>
+        <w:t>Классическая LM22 из окружения недоступна, поэтому собрана маркерная сигнатура 107 генов × 10 типов (источники: Becht 2016 MCP-counter, Bindea 2013, стандартные маркеры) — это честно задокументировано в JSON как полуколичественная. NNLS + нормализация к сумме 1 (`data/processed/gdc2_fractions.csv`). Доли согласуются с прежними маркерными скорами (корреляции 0.21–0.61). Значимые различия по физиотипам (Kruskal-Wallis p &lt; 0.001) — B_cells, CD4_T, DC, Mast, Endothelial: PH3 минимальные доли B/DC/CD4. Направленные (но незначимые, p &gt; 0.05) тренды по средним: PH2 — выше CD8_T и моноциты, PH3 — выше нейтрофилы и NK. Медианы почти всех фракций — 0 (разреженный NNLS). Качество подгонки умеренное (медиана R² = 0.157) — доли полуколичественные.</w:t>
+      </w:r>
+    </w:p>
+    <w:p>
+      <w:pPr>
+        <w:pStyle w:val="Heading2"/>
+      </w:pPr>
+      <w:r>
+        <w:t>7.8 Иммунные чекпойнты и ESTIMATE-подобные скоры</w:t>
+      </w:r>
+    </w:p>
+    <w:p>
+      <w:pPr>
+        <w:jc w:val="both"/>
+      </w:pPr>
+      <w:r>
+        <w:t>Чекпойнт-модуль (PDCD1, CD274, PDCD1LG2, CTLA4, LAG3, HAVCR2, TIGIT, IDO1, SIGLEC15, VTCN1; все измерены) и ESTIMATE-подобные ImmuneScore/StromalScore/чистота опухоли (курированные списки, не точные 141-генные Yoshihara — оговорка в JSON). Все скоры значимо различаются по физиотипам (Kruskal-Wallis p ≤ 0.0025); чекпойнт-скор максимален в PH1 (иммунно-богатый) и минимален в PH3, ImmuneScore — максимален в PH1, минимален в PH3; оценка чистоты опухоли почти одинакова во всех физиотипах (медианы 0.8225/0.8225/0.8226) и физиотипы не различает. Чекпойнт-скор коррелирует умеренно с B-клеточным прокси IGKC/CD27/MS4A1 (Spearman rho = 0.336, p &lt; 0.001) и слабо с TMB (rho = 0.075, p = 0.094); сам по себе прогнозно слаб (лог-ранг p = 0.34; Cox HR = 0.95, p = 0.61), стадия доминирует (HR = 2.55).</w:t>
+      </w:r>
+    </w:p>
+    <w:p>
+      <w:pPr>
+        <w:pStyle w:val="Heading2"/>
+      </w:pPr>
+      <w:r>
+        <w:t>7.9 TMB и выживаемость</w:t>
+      </w:r>
+    </w:p>
+    <w:p>
+      <w:pPr>
+        <w:jc w:val="both"/>
+      </w:pPr>
+      <w:r>
+        <w:t>TMB (FDA 10 mut/Mb): без поправок TMB-high живут дольше (лог-ранг p = 0.014; медиана 2393 vs 1265 дней), но после поправки на возраст+стадию эффект исчезает (Cox HR = 0.98, p = 0.85) — стадия доминирует. TMB различается по физиотипам (KW p = 1e-5): самый высокий у PH3 (медианы 1.74/2.19/2.32). Внутри физиотипов TMB-high благоприятен только в PH1 (лог-ранг p = 0.02), нейтрален в PH2/PH3. TMB слабо коррелирует с фракциями DC (rho = −0.25) и B-клеток (rho = −0.05).</w:t>
+      </w:r>
+    </w:p>
+    <w:p>
+      <w:pPr>
+        <w:pStyle w:val="Heading2"/>
+      </w:pPr>
+      <w:r>
+        <w:t>7.10 Известные сигнатуры (списки из «решение по сигнатурам.txt»)</w:t>
+      </w:r>
+    </w:p>
+    <w:p>
+      <w:pPr>
+        <w:jc w:val="both"/>
+      </w:pPr>
+      <w:r>
+        <w:t>Сигнатуры с точными списками генов из литературы (Ayers GEP18, Rooney cytolytic, IFN-γ, B-cell, proliferation Whitfield, stromal Yoshihara, hypoxia Buffa, EMT) + Hallmark (локальный GMT). Скор = средний z-скор log1p TPM.</w:t>
+      </w:r>
+    </w:p>
+    <w:tbl>
+      <w:tblPr>
+        <w:tblStyle w:val="LightGrid-Accent1"/>
+        <w:tblW w:type="auto" w:w="0"/>
+        <w:tblLook w:firstColumn="1" w:firstRow="1" w:lastColumn="0" w:lastRow="0" w:noHBand="0" w:noVBand="1" w:val="04A0"/>
+      </w:tblPr>
+      <w:tblGrid>
+        <w:gridCol w:w="2160"/>
+        <w:gridCol w:w="2160"/>
+        <w:gridCol w:w="2160"/>
+        <w:gridCol w:w="2160"/>
+      </w:tblGrid>
+      <w:tr>
+        <w:tc>
+          <w:tcPr>
+            <w:tcW w:type="dxa" w:w="2160"/>
+          </w:tcPr>
+          <w:p>
+            <w:r>
+              <w:rPr>
+                <w:b/>
+              </w:rPr>
+              <w:t>Сигнатура</w:t>
+            </w:r>
+          </w:p>
+        </w:tc>
+        <w:tc>
+          <w:tcPr>
+            <w:tcW w:type="dxa" w:w="2160"/>
+          </w:tcPr>
+          <w:p>
+            <w:r>
+              <w:rPr>
+                <w:b/>
+              </w:rPr>
+              <w:t>KW по физиотипам</w:t>
+            </w:r>
+          </w:p>
+        </w:tc>
+        <w:tc>
+          <w:tcPr>
+            <w:tcW w:type="dxa" w:w="2160"/>
+          </w:tcPr>
+          <w:p>
+            <w:r>
+              <w:rPr>
+                <w:b/>
+              </w:rPr>
+              <w:t>Лог-ранг high/low</w:t>
+            </w:r>
+          </w:p>
+        </w:tc>
+        <w:tc>
+          <w:tcPr>
+            <w:tcW w:type="dxa" w:w="2160"/>
+          </w:tcPr>
+          <w:p>
+            <w:r>
+              <w:rPr>
+                <w:b/>
+              </w:rPr>
+              <w:t>Cox HR (p)</w:t>
+            </w:r>
+          </w:p>
+        </w:tc>
+      </w:tr>
+      <w:tr>
+        <w:tc>
+          <w:tcPr>
+            <w:tcW w:type="dxa" w:w="2160"/>
+          </w:tcPr>
+          <w:p>
+            <w:r>
+              <w:t>Hypoxia (Buffa)</w:t>
+            </w:r>
+          </w:p>
+        </w:tc>
+        <w:tc>
+          <w:tcPr>
+            <w:tcW w:type="dxa" w:w="2160"/>
+          </w:tcPr>
+          <w:p>
+            <w:r>
+              <w:t>0.041</w:t>
+            </w:r>
+          </w:p>
+        </w:tc>
+        <w:tc>
+          <w:tcPr>
+            <w:tcW w:type="dxa" w:w="2160"/>
+          </w:tcPr>
+          <w:p>
+            <w:r>
+              <w:t>0.0003</w:t>
+            </w:r>
+          </w:p>
+        </w:tc>
+        <w:tc>
+          <w:tcPr>
+            <w:tcW w:type="dxa" w:w="2160"/>
+          </w:tcPr>
+          <w:p>
+            <w:r>
+              <w:t>1.75 (&lt;0.0001)</w:t>
+            </w:r>
+          </w:p>
+        </w:tc>
+      </w:tr>
+      <w:tr>
+        <w:tc>
+          <w:tcPr>
+            <w:tcW w:type="dxa" w:w="2160"/>
+          </w:tcPr>
+          <w:p>
+            <w:r>
+              <w:t>B-cell</w:t>
+            </w:r>
+          </w:p>
+        </w:tc>
+        <w:tc>
+          <w:tcPr>
+            <w:tcW w:type="dxa" w:w="2160"/>
+          </w:tcPr>
+          <w:p>
+            <w:r>
+              <w:t>≈0 (&lt;10⁻¹⁶)</w:t>
+            </w:r>
+          </w:p>
+        </w:tc>
+        <w:tc>
+          <w:tcPr>
+            <w:tcW w:type="dxa" w:w="2160"/>
+          </w:tcPr>
+          <w:p>
+            <w:r>
+              <w:t>0.0007</w:t>
+            </w:r>
+          </w:p>
+        </w:tc>
+        <w:tc>
+          <w:tcPr>
+            <w:tcW w:type="dxa" w:w="2160"/>
+          </w:tcPr>
+          <w:p>
+            <w:r>
+              <w:t>0.76 (0.005)</w:t>
+            </w:r>
+          </w:p>
+        </w:tc>
+      </w:tr>
+      <w:tr>
+        <w:tc>
+          <w:tcPr>
+            <w:tcW w:type="dxa" w:w="2160"/>
+          </w:tcPr>
+          <w:p>
+            <w:r>
+              <w:t>Proliferation (Whitfield)</w:t>
+            </w:r>
+          </w:p>
+        </w:tc>
+        <w:tc>
+          <w:tcPr>
+            <w:tcW w:type="dxa" w:w="2160"/>
+          </w:tcPr>
+          <w:p>
+            <w:r>
+              <w:t>1e-05</w:t>
+            </w:r>
+          </w:p>
+        </w:tc>
+        <w:tc>
+          <w:tcPr>
+            <w:tcW w:type="dxa" w:w="2160"/>
+          </w:tcPr>
+          <w:p>
+            <w:r>
+              <w:t>0.001</w:t>
+            </w:r>
+          </w:p>
+        </w:tc>
+        <w:tc>
+          <w:tcPr>
+            <w:tcW w:type="dxa" w:w="2160"/>
+          </w:tcPr>
+          <w:p>
+            <w:r>
+              <w:t>1.34 (0.0007)</w:t>
+            </w:r>
+          </w:p>
+        </w:tc>
+      </w:tr>
+      <w:tr>
+        <w:tc>
+          <w:tcPr>
+            <w:tcW w:type="dxa" w:w="2160"/>
+          </w:tcPr>
+          <w:p>
+            <w:r>
+              <w:t>Hallmark E2F_Targets</w:t>
+            </w:r>
+          </w:p>
+        </w:tc>
+        <w:tc>
+          <w:tcPr>
+            <w:tcW w:type="dxa" w:w="2160"/>
+          </w:tcPr>
+          <w:p>
+            <w:r>
+              <w:t>1.3e-04</w:t>
+            </w:r>
+          </w:p>
+        </w:tc>
+        <w:tc>
+          <w:tcPr>
+            <w:tcW w:type="dxa" w:w="2160"/>
+          </w:tcPr>
+          <w:p>
+            <w:r>
+              <w:t>0.002</w:t>
+            </w:r>
+          </w:p>
+        </w:tc>
+        <w:tc>
+          <w:tcPr>
+            <w:tcW w:type="dxa" w:w="2160"/>
+          </w:tcPr>
+          <w:p>
+            <w:r>
+              <w:t>1.42 (0.002)</w:t>
+            </w:r>
+          </w:p>
+        </w:tc>
+      </w:tr>
+      <w:tr>
+        <w:tc>
+          <w:tcPr>
+            <w:tcW w:type="dxa" w:w="2160"/>
+          </w:tcPr>
+          <w:p>
+            <w:r>
+              <w:t>T-cell inflamed GEP18</w:t>
+            </w:r>
+          </w:p>
+        </w:tc>
+        <w:tc>
+          <w:tcPr>
+            <w:tcW w:type="dxa" w:w="2160"/>
+          </w:tcPr>
+          <w:p>
+            <w:r>
+              <w:t>0.002</w:t>
+            </w:r>
+          </w:p>
+        </w:tc>
+        <w:tc>
+          <w:tcPr>
+            <w:tcW w:type="dxa" w:w="2160"/>
+          </w:tcPr>
+          <w:p>
+            <w:r>
+              <w:t>0.54</w:t>
+            </w:r>
+          </w:p>
+        </w:tc>
+        <w:tc>
+          <w:tcPr>
+            <w:tcW w:type="dxa" w:w="2160"/>
+          </w:tcPr>
+          <w:p>
+            <w:r>
+              <w:t>0.94 (0.49)</w:t>
+            </w:r>
+          </w:p>
+        </w:tc>
+      </w:tr>
+      <w:tr>
+        <w:tc>
+          <w:tcPr>
+            <w:tcW w:type="dxa" w:w="2160"/>
+          </w:tcPr>
+          <w:p>
+            <w:r>
+              <w:t>IFN-γ (6)</w:t>
+            </w:r>
+          </w:p>
+        </w:tc>
+        <w:tc>
+          <w:tcPr>
+            <w:tcW w:type="dxa" w:w="2160"/>
+          </w:tcPr>
+          <w:p>
+            <w:r>
+              <w:t>0.058</w:t>
+            </w:r>
+          </w:p>
+        </w:tc>
+        <w:tc>
+          <w:tcPr>
+            <w:tcW w:type="dxa" w:w="2160"/>
+          </w:tcPr>
+          <w:p>
+            <w:r>
+              <w:t>0.50</w:t>
+            </w:r>
+          </w:p>
+        </w:tc>
+        <w:tc>
+          <w:tcPr>
+            <w:tcW w:type="dxa" w:w="2160"/>
+          </w:tcPr>
+          <w:p>
+            <w:r>
+              <w:t>0.97 (0.71)</w:t>
+            </w:r>
+          </w:p>
+        </w:tc>
+      </w:tr>
+      <w:tr>
+        <w:tc>
+          <w:tcPr>
+            <w:tcW w:type="dxa" w:w="2160"/>
+          </w:tcPr>
+          <w:p>
+            <w:r>
+              <w:t>Stromal (Yoshihara)</w:t>
+            </w:r>
+          </w:p>
+        </w:tc>
+        <w:tc>
+          <w:tcPr>
+            <w:tcW w:type="dxa" w:w="2160"/>
+          </w:tcPr>
+          <w:p>
+            <w:r>
+              <w:t>0.003</w:t>
+            </w:r>
+          </w:p>
+        </w:tc>
+        <w:tc>
+          <w:tcPr>
+            <w:tcW w:type="dxa" w:w="2160"/>
+          </w:tcPr>
+          <w:p>
+            <w:r>
+              <w:t>0.28</w:t>
+            </w:r>
+          </w:p>
+        </w:tc>
+        <w:tc>
+          <w:tcPr>
+            <w:tcW w:type="dxa" w:w="2160"/>
+          </w:tcPr>
+          <w:p>
+            <w:r>
+              <w:t>1.10 (0.26)</w:t>
+            </w:r>
+          </w:p>
+        </w:tc>
+      </w:tr>
+      <w:tr>
+        <w:tc>
+          <w:tcPr>
+            <w:tcW w:type="dxa" w:w="2160"/>
+          </w:tcPr>
+          <w:p>
+            <w:r>
+              <w:t>EMT (Kalluri)</w:t>
+            </w:r>
+          </w:p>
+        </w:tc>
+        <w:tc>
+          <w:tcPr>
+            <w:tcW w:type="dxa" w:w="2160"/>
+          </w:tcPr>
+          <w:p>
+            <w:r>
+              <w:t>0.014</w:t>
+            </w:r>
+          </w:p>
+        </w:tc>
+        <w:tc>
+          <w:tcPr>
+            <w:tcW w:type="dxa" w:w="2160"/>
+          </w:tcPr>
+          <w:p>
+            <w:r>
+              <w:t>0.92</w:t>
+            </w:r>
+          </w:p>
+        </w:tc>
+        <w:tc>
+          <w:tcPr>
+            <w:tcW w:type="dxa" w:w="2160"/>
+          </w:tcPr>
+          <w:p>
+            <w:r>
+              <w:t>1.14 (0.26)</w:t>
+            </w:r>
+          </w:p>
+        </w:tc>
+      </w:tr>
+      <w:tr>
+        <w:tc>
+          <w:tcPr>
+            <w:tcW w:type="dxa" w:w="2160"/>
+          </w:tcPr>
+          <w:p>
+            <w:r>
+              <w:t>Hallmark IFN-γ / Inflammatory / Angiogenesis</w:t>
+            </w:r>
+          </w:p>
+        </w:tc>
+        <w:tc>
+          <w:tcPr>
+            <w:tcW w:type="dxa" w:w="2160"/>
+          </w:tcPr>
+          <w:p>
+            <w:r>
+              <w:t>≈0 (&lt;10⁻¹⁶)</w:t>
+            </w:r>
+          </w:p>
+        </w:tc>
+        <w:tc>
+          <w:tcPr>
+            <w:tcW w:type="dxa" w:w="2160"/>
+          </w:tcPr>
+          <w:p>
+            <w:r>
+              <w:t>0.37–0.55</w:t>
+            </w:r>
+          </w:p>
+        </w:tc>
+        <w:tc>
+          <w:tcPr>
+            <w:tcW w:type="dxa" w:w="2160"/>
+          </w:tcPr>
+          <w:p>
+            <w:r>
+              <w:t>незначимы</w:t>
+            </w:r>
+          </w:p>
+        </w:tc>
+      </w:tr>
+    </w:tbl>
+    <w:p>
+      <w:pPr>
+        <w:jc w:val="both"/>
+      </w:pPr>
+      <w:r>
+        <w:t>Сильнейший прогнозный маркер среди сигнатур — гипоксия (Buffa): лог-ранг p = 0.0003, HR 1.75 после поправки на возраст и стадию. B-клеточная инфильтрация протективна (HR 0.76), пролиферация неблагоприятна (HR 1.34) — направления совпадают с физиотипами (PH3: гипоксия/пролиферация высоки, B-клетки низки). Физиотип как предиктор (Cox, C-index 0.621) сопоставим с отдельными сигнатурами, но номограмма (п. 7.3) показывает, что комбинация клиники + физиотипа + иммунных скоров даёт C-index 0.640 на тесте.</w:t>
+      </w:r>
+    </w:p>
+    <w:p>
+      <w:pPr>
+        <w:pStyle w:val="Heading1"/>
+      </w:pPr>
+      <w:r>
         <w:t>Таблицы и рисунки</w:t>
       </w:r>
     </w:p>
@@ -2700,7 +3748,7 @@
       <w:r>
         <w:drawing>
           <wp:inline xmlns:a="http://schemas.openxmlformats.org/drawingml/2006/main" xmlns:pic="http://schemas.openxmlformats.org/drawingml/2006/picture">
-            <wp:extent cx="5486400" cy="3798277"/>
+            <wp:extent cx="5486400" cy="4220308"/>
             <wp:docPr id="5" name="Picture 5"/>
             <wp:cNvGraphicFramePr>
               <a:graphicFrameLocks noChangeAspect="1"/>
@@ -2721,7 +3769,7 @@
                   <pic:spPr>
                     <a:xfrm>
                       <a:off x="0" y="0"/>
-                      <a:ext cx="5486400" cy="3798277"/>
+                      <a:ext cx="5486400" cy="4220308"/>
                     </a:xfrm>
                     <a:prstGeom prst="rect"/>
                   </pic:spPr>
@@ -2953,6 +4001,85 @@
       </w:r>
     </w:p>
     <w:p>
+      <w:r>
+        <w:t>Рис. 11 (figures/gdc2_combined_biomarkers_km.png) — KM: 4 группы IGKC×TMB (лог-ранг крайних p = 0.028).</w:t>
+      </w:r>
+    </w:p>
+    <w:p>
+      <w:pPr>
+        <w:jc w:val="center"/>
+      </w:pPr>
+      <w:r>
+        <w:drawing>
+          <wp:inline xmlns:a="http://schemas.openxmlformats.org/drawingml/2006/main" xmlns:pic="http://schemas.openxmlformats.org/drawingml/2006/picture">
+            <wp:extent cx="5486400" cy="4310743"/>
+            <wp:docPr id="11" name="Picture 11"/>
+            <wp:cNvGraphicFramePr>
+              <a:graphicFrameLocks noChangeAspect="1"/>
+            </wp:cNvGraphicFramePr>
+            <a:graphic>
+              <a:graphicData uri="http://schemas.openxmlformats.org/drawingml/2006/picture">
+                <pic:pic>
+                  <pic:nvPicPr>
+                    <pic:cNvPr id="0" name="gdc2_combined_biomarkers_km.png"/>
+                    <pic:cNvPicPr/>
+                  </pic:nvPicPr>
+                  <pic:blipFill>
+                    <a:blip r:embed="rId19"/>
+                    <a:stretch>
+                      <a:fillRect/>
+                    </a:stretch>
+                  </pic:blipFill>
+                  <pic:spPr>
+                    <a:xfrm>
+                      <a:off x="0" y="0"/>
+                      <a:ext cx="5486400" cy="4310743"/>
+                    </a:xfrm>
+                    <a:prstGeom prst="rect"/>
+                  </pic:spPr>
+                </pic:pic>
+              </a:graphicData>
+            </a:graphic>
+          </wp:inline>
+        </w:drawing>
+      </w:r>
+    </w:p>
+    <w:p>
+      <w:r>
+        <w:t>Рис. 12 (figures/gdc2_histology.png, gdc2_histology_survival.png) — гистология × физиотипы; KM по гистологии.</w:t>
+      </w:r>
+    </w:p>
+    <w:p>
+      <w:r>
+        <w:t>Рис. 13 (figures/gdc2_gene_panel_cv.png, gdc2_gene_panel_gse_km.png) — CV панели 20–50 генов; GSE31210 KM.</w:t>
+      </w:r>
+    </w:p>
+    <w:p>
+      <w:r>
+        <w:t>Рис. 14 (figures/gdc2_deconvolution_composition.png, gdc2_deconvolution_boxplots.png) — доли 10 типов клеток по физиотипам.</w:t>
+      </w:r>
+    </w:p>
+    <w:p>
+      <w:r>
+        <w:t>Рис. 15 (figures/gdc2_checkpoints_estimate.png, gdc2_checkpoint_survival.png) — чекпойнт/ESTIMATE-скоры; KM.</w:t>
+      </w:r>
+    </w:p>
+    <w:p>
+      <w:r>
+        <w:t>Рис. 16 (figures/gdc2_tmb_survival.png, gdc2_tmb_by_physio.png) — TMB-high/low KM; TMB по физиотипам.</w:t>
+      </w:r>
+    </w:p>
+    <w:p>
+      <w:r>
+        <w:t>Рис. 17 (figures/gdc2_known_signatures_heat.png, gdc2_known_signatures_km.png) — сигнатуры по физиотипам; KM Hypoxia/B-cell/Proliferation.</w:t>
+      </w:r>
+    </w:p>
+    <w:p>
+      <w:r>
+        <w:t>Рис. 18 (figures/gdc2_nomogram.png, gdc2_nomogram_calibration.png, gdc2_nomogram_survival_scale.png) — номограмма и калибровка.</w:t>
+      </w:r>
+    </w:p>
+    <w:p>
       <w:pPr>
         <w:pStyle w:val="Heading1"/>
       </w:pPr>
@@ -3077,6 +4204,78 @@
         <w:jc w:val="both"/>
       </w:pPr>
       <w:r>
+        <w:t>python scripts\gdc2_train_test.py        # 7.1: train/test, центроид vs RF</w:t>
+      </w:r>
+    </w:p>
+    <w:p>
+      <w:pPr>
+        <w:jc w:val="both"/>
+      </w:pPr>
+      <w:r>
+        <w:t>python scripts\gdc2_nomogram.py          # 7.3: номограмма (M1–M4)</w:t>
+      </w:r>
+    </w:p>
+    <w:p>
+      <w:pPr>
+        <w:jc w:val="both"/>
+      </w:pPr>
+      <w:r>
+        <w:t>python scripts\gdc2_combined_biomarkers.py  # 7.4: IGKC × TMB</w:t>
+      </w:r>
+    </w:p>
+    <w:p>
+      <w:pPr>
+        <w:jc w:val="both"/>
+      </w:pPr>
+      <w:r>
+        <w:t>python scripts\gdc2_histology.py         # 7.5: гистология (Xena)</w:t>
+      </w:r>
+    </w:p>
+    <w:p>
+      <w:pPr>
+        <w:jc w:val="both"/>
+      </w:pPr>
+      <w:r>
+        <w:t>python scripts\gdc2_gene_panel.py        # 7.6: панель 20–50 генов + GSE31210</w:t>
+      </w:r>
+    </w:p>
+    <w:p>
+      <w:pPr>
+        <w:jc w:val="both"/>
+      </w:pPr>
+      <w:r>
+        <w:t>python scripts\gdc2_deconvolution.py     # 7.7: NNLS-доли 10 типов</w:t>
+      </w:r>
+    </w:p>
+    <w:p>
+      <w:pPr>
+        <w:jc w:val="both"/>
+      </w:pPr>
+      <w:r>
+        <w:t>python scripts\gdc2_checkpoints_estimate.py # 7.8: чекпойнты + ESTIMATE-подобные скоры</w:t>
+      </w:r>
+    </w:p>
+    <w:p>
+      <w:pPr>
+        <w:jc w:val="both"/>
+      </w:pPr>
+      <w:r>
+        <w:t>python scripts\gdc2_tmb_survival.py      # 7.9: TMB (FDA 10 mut/Mb)</w:t>
+      </w:r>
+    </w:p>
+    <w:p>
+      <w:pPr>
+        <w:jc w:val="both"/>
+      </w:pPr>
+      <w:r>
+        <w:t>python scripts\gdc2_known_signatures.py  # 7.10: известные сигнатуры</w:t>
+      </w:r>
+    </w:p>
+    <w:p>
+      <w:pPr>
+        <w:jc w:val="both"/>
+      </w:pPr>
+      <w:r>
         <w:t>```</w:t>
       </w:r>
     </w:p>
@@ -3085,7 +4284,7 @@
         <w:jc w:val="both"/>
       </w:pPr>
       <w:r>
-        <w:t>Результаты: `results/gdc_deseq2.csv`, `results/gdc2_cmp_deseq2.json`, `results/gdc2_umap.json`, `results/gdc2_physiotype_top50_genes.csv`, `results/gdc2_gsea.csv`, `results/gdc2_gsea_ora.csv`, `results/gdc2_robustness.json`, `results/gdc2_lmax.json`, `results/gdc2_clinical.json`, `results/gdc2_survival.json`, `results/gdc2_survival_igkc.json`, `results/gdc2_subtypes.json`, `results/geo_validate.json`; данные — `data/processed/gdc2_clinical_xena.tsv`, `gdc2_clinical_merged.csv`, `tcga2014_subtypes.csv`, `gse31210_expression.csv`, `gse31210_clinical.csv`; рисунки — `figures/gdc2_</w:t>
+        <w:t>Результаты: `results/gdc_deseq2.csv`, `results/gdc2_cmp_deseq2.json`, `results/gdc2_umap.json`, `results/gdc2_physiotype_top50_genes.csv`, `results/gdc2_gsea.csv`, `results/gdc2_gsea_ora.csv`, `results/gdc2_robustness.json`, `results/gdc2_lmax.json`, `results/gdc2_clinical.json`, `results/gdc2_survival.json`, `results/gdc2_survival_igkc.json`, `results/gdc2_subtypes.json`, `results/geo_validate.json`; данные — `data/processed/gdc_clinical_xena.tsv`, `gdc2_clinical_merged.csv`, `tcga2014_subtypes.csv`, `gse31210_expression.csv`, `gse31210_clinical.csv`; рисунки — `figures/gdc2_</w:t>
       </w:r>
       <w:r>
         <w:rPr>
@@ -3094,7 +4293,7 @@
         <w:t>.png`, `figures/geo_validate_</w:t>
       </w:r>
       <w:r>
-        <w:t>.png`. Репозиторий: `https://github.com/mordvinov-arch/topo-stress`.</w:t>
+        <w:t>.png`. Дополнительно: `results/gdc2_train_test.json`, `gdc2_nomogram.json`, `gdc2_combined_biomarkers.json`, `gdc2_histology.json`, `gdc2_gene_panel.json`, `gdc2_deconvolution.json`, `gdc2_checkpoints_estimate.json`, `gdc2_tmb_survival.json`, `gdc2_known_signatures.json`; данные — `data/processed/gdc2_fractions.csv`; рисунки — `figures/gdc2_{combined_biomarkers,histology,gene_panel,deconvolution,checkpoints_estimate,tmb_survival,known_signatures,nomogram}_*.png`. Репозиторий: `https://github.com/mordvinov-arch/topo-stress`.</w:t>
       </w:r>
     </w:p>
     <w:sectPr>

</xml_diff>